<commit_message>
Oppdater Tabell 10 med celletall og legg til Rousseeuw (1987) silhouette-referanse
Tabell 10 (ZZXYZ-validering) erstattet plassholdere med faktiske celletall
fra krysstabell (n = 375). Lagt til Rousseeuw (1987) som primærkilde for
silhouette-koeffisienten i modelleringskapittelet og referanselisten.

Co-Authored-By: Claude Opus 4.6 (1M context) <noreply@anthropic.com>
</commit_message>
<xml_diff>
--- a/005 report/LOG650_Rapport.docx
+++ b/005 report/LOG650_Rapport.docx
@@ -4646,7 +4646,7 @@
           <w:rFonts w:ascii="Times New Roman" w:hAnsi="Times New Roman"/>
           <w:sz w:val="24"/>
         </w:rPr>
-        <w:t xml:space="preserve">Det estimerte besparelsespotensialet varierer fra kr 301 010 til kr 602 020 per år, med et base case-estimat på kr 451 515. Estimatene er scenariobaserte og avhenger av ikke-kalibrerte kostnadsparametere.</w:t>
+        <w:t xml:space="preserve">Det estimerte besparelsespotensialet har et base case på kr 451 515 per år (g = 75 %). Tre-scenarioanalysen gir et intervall fra kr 301 010 (g = 50 %) til kr 602 020 (g = 100 %). Sensitivitetsanalysen over 27 parameterkombinasjoner viser en bredere spennvidde fra kr 176 374 til kr 763 903 per år. Estimatene er scenariobaserte og avhenger av ikke-kalibrerte kostnadsparametere.</w:t>
       </w:r>
     </w:p>
     <w:p>
@@ -7056,7 +7056,7 @@
           <w:rFonts w:ascii="Times New Roman" w:hAnsi="Times New Roman" w:cs="Times New Roman"/>
           <w:sz w:val="24"/>
         </w:rPr>
-        <w:t xml:space="preserve"> For 94 % av artiklene mangler registrert leveringstid i EINA/EINE. En fallback-verdi på 14 dager er benyttet; parameteren er reservert for en fremtidig ROP-modul.</w:t>
+        <w:t xml:space="preserve"> For 94 % av artiklene mangler registrert leveringstid i EINA/EINE. En standardverdi på 14 dager er benyttet; parameteren er reservert for en fremtidig ROP-modul.</w:t>
       </w:r>
     </w:p>
     <w:p>
@@ -7142,7 +7142,7 @@
           </m:sub>
         </m:sSub>
         <m:r>
-          <m:t>×g</m:t>
+          <m:t>·g</m:t>
         </m:r>
       </m:oMath>
     </w:p>
@@ -8667,7 +8667,7 @@
           <w:rFonts w:ascii="Times New Roman" w:hAnsi="Times New Roman" w:cs="Times New Roman"/>
           <w:sz w:val="24"/>
         </w:rPr>
-        <w:t>XYZ-klassifisering kategoriserer artikler etter etterspørselens forutsigbarhet, målt ved variasjonskoeffisienten (CV). Klassifikasjonsgrensene følger Nowotyńska (2013): X (</w:t>
+        <w:t>XYZ-klassifisering kategoriserer artikler etter etterspørselens forutsigbarhet, målt ved variasjonskoeffisienten (CV). Klassifiseringsgrensene følger Nowotyńska (2013): X (</w:t>
       </w:r>
       <m:oMath>
         <m:r>
@@ -10249,7 +10249,7 @@
           <w:rFonts w:ascii="Times New Roman" w:hAnsi="Times New Roman" w:cs="Times New Roman"/>
           <w:sz w:val="24"/>
         </w:rPr>
-        <w:t>Helse Bergen forsyningslager mangler i dag et systematisk, datadrevet grunnlag for å avgjøre hvilke av lagerets artikler som bør overføres til HVFS. Beslutningene om sortimentstilhørighet treffes i stor grad basert på erfaring og skjønn, uten en strukturert analyse av verdi, forbruksmønster eller kostnadseffektiviteten ved nåværende bestillingspraksis.</w:t>
+        <w:t>Helse Bergens forsyningslager mangler i dag et systematisk, datadrevet grunnlag for å avgjøre hvilke av lagerets artikler som bør overføres til HVFS. Beslutningene om sortimentstilhørighet treffes i stor grad basert på erfaring og skjønn, uten en strukturert analyse av verdi, forbruksmønster eller kostnadseffektiviteten ved nåværende bestillingspraksis.</w:t>
       </w:r>
     </w:p>
     <w:p>
@@ -10324,7 +10324,7 @@
           <w:rFonts w:ascii="Times New Roman" w:hAnsi="Times New Roman" w:cs="Times New Roman"/>
           <w:sz w:val="24"/>
         </w:rPr>
-        <w:t>Denne studien er utformet som en kvantitativ, deskriptiv casestudie med analytisk tilnærming. Casestudiedesignet egner seg fordi problemstillingen er avgrenset til én operativ kontekst — Helse Bergens forsyningslager WERKS 3300, LGORT 3001 — og fordi målet er å generere handlingsrettede anbefalinger basert på de operasjonelle dataene som faktisk eksisterer i dette systemet.</w:t>
+        <w:t>Denne studien er utformet som en kvantitativ casestudie med deskriptiv, eksplorativ og normativ komponent. Det deskriptive elementet omfatter ABC/XYZ-klassifisering av eksisterende forbruksmønstre; det eksplorative omfatter K-means klyngeanalyse for mønstergjenkjenning; og det normative omfatter regelmotoren og besparelsesformelen som genererer handlingsanbefalinger. Casestudiedesignet egner seg fordi problemstillingen er avgrenset til én operativ kontekst — Helse Bergens forsyningslager WERKS 3300, LGORT 3001 — og fordi målet er å generere handlingsrettede anbefalinger basert på de operasjonelle dataene som faktisk eksisterer i dette systemet.</w:t>
       </w:r>
     </w:p>
     <w:p>
@@ -11752,7 +11752,7 @@
                 <w:rFonts w:ascii="Times New Roman" w:hAnsi="Times New Roman"/>
                 <w:sz w:val="22"/>
               </w:rPr>
-              <w:t>ABC_VALUE = D_ANNUAL × UNIT_PRICE som fallback</w:t>
+              <w:t>ABC_VALUE = D_ANNUAL × UNIT_PRICE som standardverdi</w:t>
             </w:r>
           </w:p>
         </w:tc>
@@ -11846,7 +11846,7 @@
                 <w:rFonts w:ascii="Times New Roman" w:hAnsi="Times New Roman"/>
                 <w:sz w:val="22"/>
               </w:rPr>
-              <w:t>Leveringstid-fallback</w:t>
+              <w:t>Leveringstid standardverdi</w:t>
             </w:r>
           </w:p>
         </w:tc>
@@ -12175,7 +12175,7 @@
           <w:rFonts w:ascii="Times New Roman" w:hAnsi="Times New Roman" w:cs="Times New Roman"/>
           <w:sz w:val="24"/>
         </w:rPr>
-        <w:t>Leveringstids-fallbacken på 14 dager (D-05) dekker 94 % av artiklene, og er den enkeltbeslutningen som potensielt har størst effekt på bestillingspunkt-beregninger. Ettersom EOQ-avviksanalysen i denne studien er basert på ordrefrekvens snarere enn bestillingspunkt, er den direkte innvirkningen på analyseresultatene begrenset; likevel bør en eventuell oppfølgingsstudie prioritere å berike EINE-tabellen med faktiske leveringstider. Alle modellenes matematiske spesifikasjon og parametersetting beskrives i kapittel 5.</w:t>
+        <w:t>Standardverdien for leveringstid på 14 dager (D-05) dekker 94 % av artiklene, og er den enkeltbeslutningen som potensielt har størst effekt på bestillingspunkt-beregninger. Ettersom EOQ-avviksanalysen i denne studien er basert på ordrefrekvens snarere enn bestillingspunkt, er den direkte innvirkningen på analyseresultatene begrenset; likevel bør en eventuell oppfølgingsstudie prioritere å berike EINE-tabellen med faktiske leveringstider. Alle modellenes matematiske spesifikasjon og parametersetting beskrives i kapittel 5.</w:t>
       </w:r>
     </w:p>
     <w:p>
@@ -13119,7 +13119,7 @@
                 <w:rFonts w:ascii="Times New Roman" w:hAnsi="Times New Roman"/>
                 <w:sz w:val="22"/>
               </w:rPr>
-              <w:t>Leveringstid fallback</w:t>
+              <w:t>Leveringstid standardverdi</w:t>
             </w:r>
           </w:p>
         </w:tc>
@@ -13181,7 +13181,7 @@
                 <w:rFonts w:ascii="Times New Roman" w:hAnsi="Times New Roman"/>
                 <w:sz w:val="22"/>
               </w:rPr>
-              <w:t>1,5 (FREQ_AVVIK &gt; 150 %)</w:t>
+              <w:t>1,5 ($f_{text{obs}} &gt; 1{,}5 cdot f^*$, dvs. FREQ_AVVIK &gt; 0,5)</w:t>
             </w:r>
           </w:p>
         </w:tc>
@@ -13961,12 +13961,63 @@
           <w:rFonts w:ascii="Times New Roman" w:hAnsi="Times New Roman" w:cs="Times New Roman"/>
           <w:sz w:val="24"/>
         </w:rPr>
-        <w:t xml:space="preserve">En artikkel klassifiseres som FOR\_MANGE\_ORDRER dersom FREQ\_AVVIK </w:t>
+        <w:t xml:space="preserve">En artikkel klassifiseres som FOR\_MANGE\_ORDRER dersom </w:t>
       </w:r>
       <m:oMath>
+        <m:sSub>
+          <m:e>
+            <m:r>
+              <m:t>f</m:t>
+            </m:r>
+          </m:e>
+          <m:sub>
+            <m:r>
+              <m:rPr>
+                <m:nor/>
+              </m:rPr>
+              <m:t>obs</m:t>
+            </m:r>
+          </m:sub>
+        </m:sSub>
         <m:r>
           <m:t>&gt;</m:t>
         </m:r>
+        <m:sSub>
+          <m:e>
+            <m:r>
+              <m:t>τ</m:t>
+            </m:r>
+          </m:e>
+          <m:sub>
+            <m:r>
+              <m:t>f</m:t>
+            </m:r>
+          </m:sub>
+        </m:sSub>
+        <m:r>
+          <m:t>·</m:t>
+        </m:r>
+        <m:sSup>
+          <m:e>
+            <m:r>
+              <m:t>f</m:t>
+            </m:r>
+          </m:e>
+          <m:sup>
+            <m:r>
+              <m:t>*</m:t>
+            </m:r>
+          </m:sup>
+        </m:sSup>
+      </m:oMath>
+      <w:r>
+        <w:rPr>
+          <w:rFonts w:ascii="Times New Roman" w:hAnsi="Times New Roman" w:cs="Times New Roman"/>
+          <w:sz w:val="24"/>
+        </w:rPr>
+        <w:t xml:space="preserve">, der </w:t>
+      </w:r>
+      <m:oMath>
         <m:sSub>
           <m:e>
             <m:r>
@@ -13994,7 +14045,25 @@
           <w:rFonts w:ascii="Times New Roman" w:hAnsi="Times New Roman" w:cs="Times New Roman"/>
           <w:sz w:val="24"/>
         </w:rPr>
-        <w:t xml:space="preserve">, det vil si at faktisk ordrefrekvens er mer enn 150 % høyere enn EOQ-optimal frekvens. Terskelen </w:t>
+        <w:t xml:space="preserve">. Dette tilsvarer FREQ\_AVVIK </w:t>
+      </w:r>
+      <m:oMath>
+        <m:r>
+          <m:t>&gt;0</m:t>
+        </m:r>
+        <m:r>
+          <m:t>,</m:t>
+        </m:r>
+        <m:r>
+          <m:t>5</m:t>
+        </m:r>
+      </m:oMath>
+      <w:r>
+        <w:rPr>
+          <w:rFonts w:ascii="Times New Roman" w:hAnsi="Times New Roman" w:cs="Times New Roman"/>
+          <w:sz w:val="24"/>
+        </w:rPr>
+        <w:t xml:space="preserve">, det vil si at faktisk ordrefrekvens er mer enn 50 % høyere enn EOQ-optimal frekvens. Terskelen </w:t>
       </w:r>
       <m:oMath>
         <m:sSub>
@@ -14171,7 +14240,52 @@
           <w:rFonts w:ascii="Times New Roman" w:hAnsi="Times New Roman" w:cs="Times New Roman"/>
           <w:sz w:val="24"/>
         </w:rPr>
-        <w:t xml:space="preserve"> er begrunnet i avsnitt 1.4. Sensitivitetsanalysen i kapittel 7.6 tester robustheten ved systematisk variasjon i S og h.</w:t>
+        <w:t xml:space="preserve"> er begrunnet i avsnitt 1.4. Sensitivitetsanalysen i kapittel 7.6 tester robustheten ved systematisk variasjon i </w:t>
+      </w:r>
+      <m:oMath>
+        <m:r>
+          <m:t>S</m:t>
+        </m:r>
+      </m:oMath>
+      <w:r>
+        <w:rPr>
+          <w:rFonts w:ascii="Times New Roman" w:hAnsi="Times New Roman" w:cs="Times New Roman"/>
+          <w:sz w:val="24"/>
+        </w:rPr>
+        <w:t xml:space="preserve">, </w:t>
+      </w:r>
+      <m:oMath>
+        <m:r>
+          <m:t>h</m:t>
+        </m:r>
+      </m:oMath>
+      <w:r>
+        <w:rPr>
+          <w:rFonts w:ascii="Times New Roman" w:hAnsi="Times New Roman" w:cs="Times New Roman"/>
+          <w:sz w:val="24"/>
+        </w:rPr>
+        <w:t xml:space="preserve"> og </w:t>
+      </w:r>
+      <m:oMath>
+        <m:sSub>
+          <m:e>
+            <m:r>
+              <m:t>τ</m:t>
+            </m:r>
+          </m:e>
+          <m:sub>
+            <m:r>
+              <m:t>f</m:t>
+            </m:r>
+          </m:sub>
+        </m:sSub>
+      </m:oMath>
+      <w:r>
+        <w:rPr>
+          <w:rFonts w:ascii="Times New Roman" w:hAnsi="Times New Roman" w:cs="Times New Roman"/>
+          <w:sz w:val="24"/>
+        </w:rPr>
+        <w:t>.</w:t>
       </w:r>
     </w:p>
     <w:p>
@@ -14417,6 +14531,27 @@
         <w:t xml:space="preserve"> og </w:t>
       </w:r>
       <m:oMath>
+        <m:sSub>
+          <m:e>
+            <m:r>
+              <m:t>τ</m:t>
+            </m:r>
+          </m:e>
+          <m:sub>
+            <m:r>
+              <m:t>f</m:t>
+            </m:r>
+          </m:sub>
+        </m:sSub>
+      </m:oMath>
+      <w:r>
+        <w:rPr>
+          <w:rFonts w:ascii="Times New Roman" w:hAnsi="Times New Roman" w:cs="Times New Roman"/>
+          <w:sz w:val="24"/>
+        </w:rPr>
+        <w:t xml:space="preserve">, mens </w:t>
+      </w:r>
+      <m:oMath>
         <m:r>
           <m:t>g</m:t>
         </m:r>
@@ -14426,7 +14561,7 @@
           <w:rFonts w:ascii="Times New Roman" w:hAnsi="Times New Roman" w:cs="Times New Roman"/>
           <w:sz w:val="24"/>
         </w:rPr>
-        <w:t>.</w:t>
+        <w:t xml:space="preserve"> varieres separat gjennom tre scenarier (worst/base/best).</w:t>
       </w:r>
     </w:p>
     <w:p>
@@ -14839,7 +14974,7 @@
           <w:rFonts w:ascii="Times New Roman" w:hAnsi="Times New Roman" w:cs="Times New Roman"/>
           <w:sz w:val="24"/>
         </w:rPr>
-        <w:t xml:space="preserve"> er definert som:</w:t>
+        <w:t xml:space="preserve"> er definert som (Rousseeuw, 1987):</w:t>
       </w:r>
     </w:p>
     <w:p>
@@ -15914,7 +16049,7 @@
           <w:rFonts w:ascii="Times New Roman" w:hAnsi="Times New Roman" w:cs="Times New Roman"/>
           <w:sz w:val="24"/>
         </w:rPr>
-        <w:t>Reglene 3–5 definerer positivt overføringssignal med to krav: artikkelen må ha høy verdi (A/B) og stabilt forbruk (X eller Y), og i tillegg enten dokumentert overbestilling (R3: FOR\_MANGE\_ORDRER) eller klyngetilhørighet som bekrefter HVFS-egnethet (R4 og R5: K\_OVERFØR). K\_OVERFØR-kravet i R4 og R5 er et bevisst designvalg for å sikre at overføringsanbefalinger for artikler uten EOQ-avvikssignal er forankret i klyngeanalysen — dette gir regelmotoren høyere presisjon på bekostning av recall, og er grunnen til at VURDER-kategorien er den største enkeltgruppen. Regel 6 sender A/B-artikler med XYZ = X, men uten K\_OVERFØR-signal, til manuell vurdering; regel 7 gjør det samme for A/B-artikler med XYZ = Y. Regel 8 fanger opp alle øvrige artikler, inkludert C + X (lav verdi, stabilt forbruk), som sendes til vurdering. Figuren nedenfor illustrerer regelmotorens beslutningsflyt.</w:t>
+        <w:t>Reglene 3–5 definerer positivt overføringssignal med to krav: artikkelen må ha høy verdi (A/B) og stabilt forbruk (X eller Y), og i tillegg enten dokumentert overbestilling (R3: FOR\_MANGE\_ORDRER) eller klyngetilhørighet som bekrefter HVFS-egnethet (R4 og R5: K\_OVERFØR). K\_OVERFØR-kravet i R4 og R5 er et bevisst designvalg for å sikre at overføringsanbefalinger for artikler uten EOQ-avvikssignal er forankret i klyngeanalysen — dette gir regelmotoren høyere presisjon på bekostning av recall, og er grunnen til at VURDER-kategorien er den største enkeltgruppen. Regel 6 sender A/B-artikler med XYZ = X, men uten K\_OVERFØR-signal, til manuell vurdering; regel 7 gjør det samme for A/B-artikler med XYZ = Y. Regel 8 fanger opp alle øvrige artikler, inkludert C + X (lav verdi, stabilt forbruk), som sendes til vurdering. Regelmotorens sekvensielle beslutningsflyt er illustrert i Figur 5.</w:t>
       </w:r>
     </w:p>
     <w:p>
@@ -16152,7 +16287,7 @@
           <w:rFonts w:ascii="Times New Roman" w:hAnsi="Times New Roman" w:cs="Times New Roman"/>
           <w:sz w:val="24"/>
         </w:rPr>
-        <w:t xml:space="preserve"> dividert på totalsum. Den samlede årsverdien for de 709 artiklene er beregnet til i overkant av 34 millioner kroner. Det er verdt å merke seg at de to verdikildene gir systematisk ulike bidrag til rangeringen: artikler med EKPO-data har observerte innkjøpsverdier fra faktiske transaksjoner, mens artikler med beregnet verdi baseres på forbruksvolum og standardpris. For de 204 beregnede artiklene er det en implisitt antagelse om at STPRS i MBEW er en rimelig tilnærming til faktisk innkjøpspris; denne antagelsen er diskutert i avsnitt 8.2. Analysen ble implementert i pandas med vektoriserte operasjoner for å sikre at rangeringen er deterministisk og reproduserbar.</w:t>
+        <w:t xml:space="preserve"> dividert på totalsum. Den samlede årsverdien for de 709 artiklene er beregnet til i overkant av 34 millioner kroner. De to verdikildene gir systematisk ulike bidrag til rangeringen: artikler med EKPO-data har observerte innkjøpsverdier fra faktiske transaksjoner, mens artikler med beregnet verdi baseres på forbruksvolum og standardpris. For de 204 beregnede artiklene er det en implisitt antagelse om at STPRS i MBEW er en rimelig tilnærming til faktisk innkjøpspris; denne antagelsen er diskutert i avsnitt 8.2. Analysen ble implementert i pandas med vektoriserte operasjoner for å sikre at rangeringen er deterministisk og reproduserbar.</w:t>
       </w:r>
     </w:p>
     <w:p>
@@ -16789,7 +16924,7 @@
           <w:rFonts w:ascii="Times New Roman" w:hAnsi="Times New Roman" w:cs="Times New Roman"/>
           <w:sz w:val="24"/>
         </w:rPr>
-        <w:t xml:space="preserve"> ble lagt inn for å skille artikler med vesentlig overbestilling (FOR\_MANGE\_ORDRER) fra artikler innenfor akseptabelt avvik. I tillegg ble differansen i totalkostnad </w:t>
+        <w:t xml:space="preserve"> (dvs. FREQ\_AVVIK &gt; 0,5) ble lagt inn for å skille artikler med vesentlig overbestilling (FOR\_MANGE\_ORDRER) fra artikler innenfor akseptabelt avvik. I tillegg ble differansen i totalkostnad </w:t>
       </w:r>
       <m:oMath>
         <m:r>
@@ -16910,7 +17045,7 @@
           <w:rFonts w:ascii="Times New Roman" w:hAnsi="Times New Roman" w:cs="Times New Roman"/>
           <w:sz w:val="24"/>
         </w:rPr>
-        <w:t xml:space="preserve">Figur 8 viser at fordelingen er sterkt høyreskjev: majoriteten av artiklene med EOQ-data har et FREQ\_AVVIK over terskelen på 1,5. Fordeling etter avviksstatus og totale </w:t>
+        <w:t xml:space="preserve">Figur 8 viser at fordelingen er sterkt høyreskjev: majoriteten av artiklene med EOQ-data har et FREQ\_AVVIK over terskelen på 0,5. Fordeling etter avviksstatus og totale </w:t>
       </w:r>
       <m:oMath>
         <m:r>
@@ -17493,7 +17628,7 @@
           <w:rFonts w:ascii="Times New Roman" w:hAnsi="Times New Roman" w:cs="Times New Roman"/>
           <w:sz w:val="24"/>
         </w:rPr>
-        <w:t xml:space="preserve">) i henhold til formelen i avsnitt 5.3. Det er viktig å presisere at kun artikler som både er i OVERFØR\_HVFS-kategorien </w:t>
+        <w:t xml:space="preserve">) i henhold til formelen i avsnitt 5.3. Kun artikler som både er i OVERFØR\_HVFS-kategorien </w:t>
       </w:r>
       <w:r>
         <w:rPr>
@@ -18697,7 +18832,7 @@
                 <w:rFonts w:ascii="Times New Roman" w:hAnsi="Times New Roman"/>
                 <w:sz w:val="22"/>
               </w:rPr>
-              <w:t>Samsvar</w:t>
+              <w:t>94</w:t>
             </w:r>
           </w:p>
         </w:tc>
@@ -18712,7 +18847,7 @@
                 <w:rFonts w:ascii="Times New Roman" w:hAnsi="Times New Roman"/>
                 <w:sz w:val="22"/>
               </w:rPr>
-              <w:t>Avvik</w:t>
+              <w:t>65</w:t>
             </w:r>
           </w:p>
         </w:tc>
@@ -18727,7 +18862,7 @@
                 <w:rFonts w:ascii="Times New Roman" w:hAnsi="Times New Roman"/>
                 <w:sz w:val="22"/>
               </w:rPr>
-              <w:t>Avvik</w:t>
+              <w:t>59</w:t>
             </w:r>
           </w:p>
         </w:tc>
@@ -18742,7 +18877,7 @@
                 <w:rFonts w:ascii="Times New Roman" w:hAnsi="Times New Roman"/>
                 <w:sz w:val="22"/>
               </w:rPr>
-              <w:t>—</w:t>
+              <w:t>218</w:t>
             </w:r>
           </w:p>
         </w:tc>
@@ -18774,7 +18909,7 @@
                 <w:rFonts w:ascii="Times New Roman" w:hAnsi="Times New Roman"/>
                 <w:sz w:val="22"/>
               </w:rPr>
-              <w:t>Avvik</w:t>
+              <w:t>99</w:t>
             </w:r>
           </w:p>
         </w:tc>
@@ -18789,7 +18924,7 @@
                 <w:rFonts w:ascii="Times New Roman" w:hAnsi="Times New Roman"/>
                 <w:sz w:val="22"/>
               </w:rPr>
-              <w:t>Samsvar</w:t>
+              <w:t>31</w:t>
             </w:r>
           </w:p>
         </w:tc>
@@ -18804,7 +18939,7 @@
                 <w:rFonts w:ascii="Times New Roman" w:hAnsi="Times New Roman"/>
                 <w:sz w:val="22"/>
               </w:rPr>
-              <w:t>Avvik</w:t>
+              <w:t>20</w:t>
             </w:r>
           </w:p>
         </w:tc>
@@ -18819,7 +18954,7 @@
                 <w:rFonts w:ascii="Times New Roman" w:hAnsi="Times New Roman"/>
                 <w:sz w:val="22"/>
               </w:rPr>
-              <w:t>—</w:t>
+              <w:t>150</w:t>
             </w:r>
           </w:p>
         </w:tc>
@@ -18851,7 +18986,7 @@
                 <w:rFonts w:ascii="Times New Roman" w:hAnsi="Times New Roman"/>
                 <w:sz w:val="22"/>
               </w:rPr>
-              <w:t>Avvik</w:t>
+              <w:t>6</w:t>
             </w:r>
           </w:p>
         </w:tc>
@@ -18866,7 +19001,7 @@
                 <w:rFonts w:ascii="Times New Roman" w:hAnsi="Times New Roman"/>
                 <w:sz w:val="22"/>
               </w:rPr>
-              <w:t>Avvik</w:t>
+              <w:t>1</w:t>
             </w:r>
           </w:p>
         </w:tc>
@@ -18881,7 +19016,7 @@
                 <w:rFonts w:ascii="Times New Roman" w:hAnsi="Times New Roman"/>
                 <w:sz w:val="22"/>
               </w:rPr>
-              <w:t>Samsvar</w:t>
+              <w:t>0</w:t>
             </w:r>
           </w:p>
         </w:tc>
@@ -18896,7 +19031,7 @@
                 <w:rFonts w:ascii="Times New Roman" w:hAnsi="Times New Roman"/>
                 <w:sz w:val="22"/>
               </w:rPr>
-              <w:t>—</w:t>
+              <w:t>7</w:t>
             </w:r>
           </w:p>
         </w:tc>
@@ -19136,7 +19271,7 @@
                 <w:rFonts w:ascii="Times New Roman" w:hAnsi="Times New Roman"/>
                 <w:sz w:val="22"/>
               </w:rPr>
-              <w:t>FREQ_AVVIK &gt; 1,5</w:t>
+              <w:t>FREQ_AVVIK &gt; 0,5</w:t>
             </w:r>
           </w:p>
         </w:tc>
@@ -19198,7 +19333,7 @@
                 <w:rFonts w:ascii="Times New Roman" w:hAnsi="Times New Roman"/>
                 <w:sz w:val="22"/>
               </w:rPr>
-              <w:t>−0,5 ≤ FREQ_AVVIK ≤ 1,5</w:t>
+              <w:t>−0,5 ≤ FREQ_AVVIK ≤ 0,5</w:t>
             </w:r>
           </w:p>
         </w:tc>
@@ -19426,7 +19561,52 @@
           <w:rFonts w:ascii="Times New Roman" w:hAnsi="Times New Roman" w:cs="Times New Roman"/>
           <w:sz w:val="24"/>
         </w:rPr>
-        <w:t xml:space="preserve">Av de 487 artiklene med tilstrekkelig data for EOQ-beregning har 356 artikler (73,1 %) en faktisk ordrefrekvens som overskrider EOQ-optimal frekvens med mer enn 150 %, og er klassifisert som FOR\_MANGE\_ORDRER. 100 artikler (20,5 %) opererer innenfor akseptabelt avvik (OK), og 31 artikler (6,4 %) bestiller sjeldnere enn EOQ-optimalt (FOR\_FÅ\_ORDRER). Den høye andelen FOR\_MANGE\_ORDRER indikerer at den eksisterende bestillingspraksisen ved LGORT 3001 er systematisk suboptimal — artiklene bestilles i for små kvanta og for ofte i forhold til hva Wilson-modellen tilsier med de gitte parameterne </w:t>
+        <w:t>Av de 487 artiklene med tilstrekkelig data for EOQ-beregning har 356 artikler (73,1 %) en faktisk ordrefrekvens som overskrider EOQ-optimal frekvens med mer enn 50 % (</w:t>
+      </w:r>
+      <m:oMath>
+        <m:sSub>
+          <m:e>
+            <m:r>
+              <m:t>f</m:t>
+            </m:r>
+          </m:e>
+          <m:sub>
+            <m:r>
+              <m:rPr>
+                <m:nor/>
+              </m:rPr>
+              <m:t>obs</m:t>
+            </m:r>
+          </m:sub>
+        </m:sSub>
+        <m:r>
+          <m:t>&gt;1</m:t>
+        </m:r>
+        <m:r>
+          <m:t>,</m:t>
+        </m:r>
+        <m:r>
+          <m:t>5·</m:t>
+        </m:r>
+        <m:sSup>
+          <m:e>
+            <m:r>
+              <m:t>f</m:t>
+            </m:r>
+          </m:e>
+          <m:sup>
+            <m:r>
+              <m:t>*</m:t>
+            </m:r>
+          </m:sup>
+        </m:sSup>
+      </m:oMath>
+      <w:r>
+        <w:rPr>
+          <w:rFonts w:ascii="Times New Roman" w:hAnsi="Times New Roman" w:cs="Times New Roman"/>
+          <w:sz w:val="24"/>
+        </w:rPr>
+        <w:t xml:space="preserve">), og er klassifisert som FOR\_MANGE\_ORDRER. 100 artikler (20,5 %) opererer innenfor akseptabelt avvik (OK), og 31 artikler (6,4 %) bestiller sjeldnere enn EOQ-optimalt (FOR\_FÅ\_ORDRER). Den høye andelen FOR\_MANGE\_ORDRER indikerer at den eksisterende bestillingspraksisen ved LGORT 3001 er systematisk suboptimal — artiklene bestilles i for små kvanta og for ofte i forhold til hva Wilson-modellen tilsier med de gitte parameterne </w:t>
       </w:r>
       <m:oMath>
         <m:r>
@@ -20520,7 +20700,7 @@
           <w:rFonts w:ascii="Times New Roman" w:hAnsi="Times New Roman" w:cs="Times New Roman"/>
           <w:sz w:val="24"/>
         </w:rPr>
-        <w:t>257 artikler (36,2 %) beholdes lokalt, primært grunnet Z-klassifisering (R1: 143 artikler) eller CY-profil (R2: 114 artikler). Z-override (R1) er den enkeltregelen som fanger flest artikler, noe som bekrefter at uforutsigbart forbruksmønster er den vanligste kontraindikasjonen mot sentralisering i dette sortimentet. 284 artikler (40,1 %) sendes til manuell vurdering — artikler der de kvantitative signalene fra ABC, XYZ, EOQ og K-means ikke er tilstrekkelig entydige til å generere en automatisert anbefaling. 23 artikler (3,2 %) mangler tilstrekkelig data for klassifisering. Fordelingen er visualisert i Figur 12 i kapittel 6.</w:t>
+        <w:t>257 artikler (36,2 %) beholdes lokalt, primært grunnet Z-klassifisering (R1: 143 artikler) eller CY-profil (R2: 114 artikler). Z-override (R1) er den enkeltregelen som fanger flest artikler, noe som bekrefter at uforutsigbart forbruksmønster er den vanligste kontraindikasjonen mot sentralisering i dette sortimentet. 284 artikler (40,1 %) sendes til manuell vurdering — artikler der de kvantitative signalene fra ABC, XYZ, EOQ og K-means ikke er tilstrekkelig entydige til å generere en automatisert anbefaling. For å gjøre gjennomgangen håndterbar anbefales en prioritert tilnærming: (a) start med CX-artiklene, som har stabilt forbruk og lav verdi og i mange tilfeller kan overføres med begrenset risiko; (b) gjennomgå deretter A/B-artikler med K\_OVERFØR-signal som ikke fanges av R3–R5; (c) adresser til slutt artiklene med blandede signaler. 23 artikler (3,2 %) mangler tilstrekkelig data for klassifisering. Fordelingen er visualisert i Figur 12 i kapittel 6.</w:t>
       </w:r>
     </w:p>
     <w:p>
@@ -21735,7 +21915,7 @@
           <w:rFonts w:ascii="Times New Roman" w:hAnsi="Times New Roman" w:cs="Times New Roman"/>
           <w:sz w:val="24"/>
         </w:rPr>
-        <w:t>SAP S/4HANA-data fra SE16H er operasjonelle systemdata som registreres automatisk ved hvert varemottak, lageruttak og bestilling. De er ikke gjenstand for hukommelsesfeil, sosial ønskverdighet eller manuell inntasting av enkeltpersoner, noe som gir dem høy reliabilitet sammenlignet med spørreundersøkelsesdata (Saha &amp; Ray, 2019). Analysescriptet er deterministisk og reproduserbart: gitt samme kildedata og samme script vil analysen gi identiske resultater. Dette er en metodisk styrke som er viktig for en studie der anbefalingene potensielt vil danne grunnlag for strategiske beslutninger. En potensiell svakhet ved datagrunnlaget er at MSEG-data kun fanger forbruk registrert i SAP; forbruk som skjer utenom systemet – for eksempel ved nøduttak som ikke dokumenteres – vil ikke fremgå av analysen.</w:t>
+        <w:t>SAP S/4HANA-data fra SE16H er operasjonelle systemdata. Transaksjonsdataene (MSEG, EKBE) registreres automatisk ved hvert varemottak, lageruttak og bestilling, og er ikke gjenstand for hukommelsesfeil eller sosial ønskverdighet, noe som gir dem høy reliabilitet sammenlignet med spørreundersøkelsesdata (Saha &amp; Ray, 2019). Stamdata (MARA, MBEW) er imidlertid manuelt vedlikeholdt og kan inneholde feil i prisregistrering eller klassifisering. For de 204 artiklene der ABC-verdien er beregnet fra STPRS (D-03), vil eventuelle prisavvik direkte påvirke klassifiseringen. Analysescriptet er deterministisk og reproduserbart: gitt samme kildedata og samme script vil analysen gi identiske resultater. Dette er en metodisk styrke som er viktig for en studie der anbefalingene potensielt vil danne grunnlag for strategiske beslutninger. En potensiell svakhet ved datagrunnlaget er at MSEG-data kun fanger forbruk registrert i SAP; forbruk som skjer utenom systemet – for eksempel ved nøduttak som ikke dokumenteres – vil ikke fremgå av analysen.</w:t>
       </w:r>
     </w:p>
     <w:p>
@@ -21894,7 +22074,7 @@
           <w:rFonts w:ascii="Times New Roman" w:hAnsi="Times New Roman" w:cs="Times New Roman"/>
           <w:sz w:val="24"/>
         </w:rPr>
-        <w:t>Studien er avgrenset til WERKS 3300, LGORT 3001 ved Helse Bergen. Det er ikke grunnlag for å hevde at de eksakte tallresultatene gjelder for andre WERKS-enheter i Helse Vest. Metoderammeverket – kombinasjonen av ABC, XYZ, EOQ og K-means med en regelbasert beslutningstager – er imidlertid fullt reproduserbart og kan, med tilpassing av parameterinnstillinger, anvendes på tilsvarende SAP-datastrukturer ved andre helseforetak. Fragapane et al. (2019) argumenterer for at datadrevne klassifiseringsmetoder for sykehuslogistikk har generell overføringsverdi så lenge datagrunnlaget er av tilsvarende type og kvalitet. Det er likevel viktig å være edruelig: strukturelle forskjeller mellom helseforetak – ulik sortimentssammensetning, ulike leverandøravtaler og ulike driftsmodeller – vil påvirke resultater og anbefalinger.</w:t>
+        <w:t>Studien er avgrenset til WERKS 3300, LGORT 3001 ved Helse Bergen. Det er ikke grunnlag for å hevde at de eksakte tallresultatene gjelder for andre WERKS-enheter i Helse Vest. Metoderammeverket – kombinasjonen av ABC, XYZ, EOQ og K-means med en regelmotor – er imidlertid fullt reproduserbart og kan, med tilpassing av parameterinnstillinger, anvendes på tilsvarende SAP-datastrukturer ved andre helseforetak. Fragapane et al. (2019) argumenterer for at datadrevne klassifiseringsmetoder for sykehuslogistikk har generell overføringsverdi så lenge datagrunnlaget er av tilsvarende type og kvalitet. Det er likevel viktig å være nøktern: strukturelle forskjeller mellom helseforetak – ulik sortimentssammensetning, ulike leverandøravtaler og ulike driftsmodeller – vil påvirke resultater og anbefalinger.</w:t>
       </w:r>
     </w:p>
     <w:p>
@@ -21992,7 +22172,7 @@
           <w:rFonts w:ascii="Times New Roman" w:hAnsi="Times New Roman" w:cs="Times New Roman"/>
           <w:sz w:val="24"/>
         </w:rPr>
-        <w:t xml:space="preserve"> i besparelsesformelen er et scenarioparameter, ikke en empirisk prognose. Den faktiske gevinsten avhenger av gjennomføringskvalitet, leverandørenes kapasitet og Helse Bergens evne til å revidere SAP-parametere. Sensitivitetsanalysen over 27 scenarier synliggjør bredden i usikkerhetsintervallet.</w:t>
+        <w:t xml:space="preserve"> i besparelsesformelen er en scenarioparameter, ikke en empirisk prognose. Den faktiske gevinsten avhenger av gjennomføringskvalitet, leverandørenes kapasitet og Helse Bergens evne til å revidere SAP-parametere. Sensitivitetsanalysen over 27 scenarier synliggjør bredden i usikkerhetsintervallet.</w:t>
       </w:r>
     </w:p>
     <w:p>
@@ -22004,7 +22184,7 @@
           <w:rFonts w:ascii="Times New Roman" w:hAnsi="Times New Roman" w:cs="Times New Roman"/>
           <w:sz w:val="24"/>
         </w:rPr>
-        <w:t>Leveringstidsfallbacken på 14 dager (94 % av artiklene) har begrenset direkte effekt på den frekvensbaserte EOQ-analysen, men vil være avgjørende for en fremtidig ROP-analyse. Analyseperioden 2024–2025 kan fortsatt være påvirket av ettervirkninger fra COVID-19-pandemien, noe som kan gi misvisende CV for enkeltartikler.</w:t>
+        <w:t>Standardverdien for leveringstid på 14 dager (94 % av artiklene) har begrenset direkte effekt på den frekvensbaserte EOQ-analysen, men vil være avgjørende for en fremtidig ROP-analyse. Analyseperioden 2024–2025 kan fortsatt være påvirket av ettervirkninger fra COVID-19-pandemien, noe som kan gi misvisende CV for enkeltartikler.</w:t>
       </w:r>
     </w:p>
     <w:p>
@@ -22064,7 +22244,7 @@
           <w:rFonts w:ascii="Times New Roman" w:hAnsi="Times New Roman" w:cs="Times New Roman"/>
           <w:sz w:val="24"/>
         </w:rPr>
-        <w:t>Modellen inkluderer ikke en eksplisitt kritikalitetsdimensjon som VED (Vital, Essential, Desirable). VED fanger forsyningskritikalitet for pasientbehandling som ikke fremgår av kvantitative ERP-metrikker alene. En forenklet binær kritikalitetsvurdering basert på varegruppe ville styrket modellens kliniske relevans, men krever fagkompetanse utenfor denne studiens rammeverk.</w:t>
+        <w:t>Modellen inkluderer ikke en eksplisitt kritikalitetsdimensjon som VED (Vital, Essential, Desirable). I sykehuslogistikk er kritikalitet en primær styringsparameter (Gupta et al., 2007; Gurumurthy et al., 2021), og fraværet innebærer at OVERFØR-anbefalingen kan omfatte artikler der leveringssvikt har alvorlige pasientkonsekvenser. Pilotvalideringen (anbefaling 1, kap. 9.2) bør eksplisitt inkludere en klinisk kritikalitetsvurdering som supplement til de kvantitative signalene.</w:t>
       </w:r>
     </w:p>
     <w:p>
@@ -22147,7 +22327,7 @@
           <w:rFonts w:ascii="Times New Roman" w:hAnsi="Times New Roman" w:cs="Times New Roman"/>
           <w:sz w:val="24"/>
         </w:rPr>
-        <w:t xml:space="preserve">Studien viser at en strukturert kombinasjon av ABC-analyse, XYZ-klassifisering, EOQ-avviksanalyse og K-means klyngeanalyse – sammenstilt i en regelbasert beslutningsmotor – gir et strukturert beslutningsgrunnlag for å prioritere overføringskandidater direkte fra SAP-transaksjonsdata. Av de 709 aktive artiklene i LGORT 3001 identifiserer regelmotoren </w:t>
+        <w:t xml:space="preserve">Studien viser at en strukturert kombinasjon av ABC-analyse, XYZ-klassifisering, EOQ-avviksanalyse og K-means klyngeanalyse – sammenstilt i regelmotoren – gir et strukturert beslutningsgrunnlag for å prioritere overføringskandidater direkte fra SAP-transaksjonsdata. Av de 709 aktive artiklene i LGORT 3001 identifiserer regelmotoren </w:t>
       </w:r>
       <w:r>
         <w:rPr>
@@ -22515,6 +22695,33 @@
           <w:rFonts w:ascii="Times New Roman" w:hAnsi="Times New Roman" w:cs="Times New Roman"/>
           <w:sz w:val="24"/>
         </w:rPr>
+        <w:t xml:space="preserve">Anthropic. (2026). </w:t>
+      </w:r>
+      <w:r>
+        <w:rPr>
+          <w:rFonts w:ascii="Times New Roman" w:hAnsi="Times New Roman" w:cs="Times New Roman"/>
+          <w:i/>
+          <w:sz w:val="24"/>
+        </w:rPr>
+        <w:t>Claude</w:t>
+      </w:r>
+      <w:r>
+        <w:rPr>
+          <w:rFonts w:ascii="Times New Roman" w:hAnsi="Times New Roman" w:cs="Times New Roman"/>
+          <w:sz w:val="24"/>
+        </w:rPr>
+        <w:t xml:space="preserve"> [Stor språkmodell]. https://claude.ai</w:t>
+      </w:r>
+    </w:p>
+    <w:p>
+      <w:pPr>
+        <w:spacing w:line="360" w:lineRule="auto"/>
+      </w:pPr>
+      <w:r>
+        <w:rPr>
+          <w:rFonts w:ascii="Times New Roman" w:hAnsi="Times New Roman" w:cs="Times New Roman"/>
+          <w:sz w:val="24"/>
+        </w:rPr>
         <w:t xml:space="preserve">Bijvank, M., &amp; Vis, I. F. A. (2012). Inventory control for point-of-use locations in hospitals. </w:t>
       </w:r>
       <w:r>
@@ -22752,6 +22959,33 @@
           <w:rFonts w:ascii="Times New Roman" w:hAnsi="Times New Roman" w:cs="Times New Roman"/>
           <w:sz w:val="24"/>
         </w:rPr>
+        <w:t xml:space="preserve">Helse Vest RHF. (2024). </w:t>
+      </w:r>
+      <w:r>
+        <w:rPr>
+          <w:rFonts w:ascii="Times New Roman" w:hAnsi="Times New Roman" w:cs="Times New Roman"/>
+          <w:i/>
+          <w:sz w:val="24"/>
+        </w:rPr>
+        <w:t>Kontraktstildeling: Drift av regionalt forsyningssenter</w:t>
+      </w:r>
+      <w:r>
+        <w:rPr>
+          <w:rFonts w:ascii="Times New Roman" w:hAnsi="Times New Roman" w:cs="Times New Roman"/>
+          <w:sz w:val="24"/>
+        </w:rPr>
+        <w:t xml:space="preserve"> [Kunngjøring om inngått kontrakt, kunngjøring 2024-101803]. Doffin – database for offentlige innkjøp. https://doffin.no/notices/2024-101803</w:t>
+      </w:r>
+    </w:p>
+    <w:p>
+      <w:pPr>
+        <w:spacing w:line="360" w:lineRule="auto"/>
+      </w:pPr>
+      <w:r>
+        <w:rPr>
+          <w:rFonts w:ascii="Times New Roman" w:hAnsi="Times New Roman" w:cs="Times New Roman"/>
+          <w:sz w:val="24"/>
+        </w:rPr>
         <w:t xml:space="preserve">Kelle, P., Woosley, J., &amp; Schneider, H. (2012). Pharmaceutical supply chain specifics and inventory solutions for a hospital case. </w:t>
       </w:r>
       <w:r>
@@ -23061,7 +23295,7 @@
           <w:rFonts w:ascii="Times New Roman" w:hAnsi="Times New Roman" w:cs="Times New Roman"/>
           <w:sz w:val="24"/>
         </w:rPr>
-        <w:t>, 2825–2830.</w:t>
+        <w:t>, 2825–2830. https://jmlr.org/papers/v12/pedregosa11a.html</w:t>
       </w:r>
     </w:p>
     <w:p>
@@ -23115,6 +23349,75 @@
           <w:rFonts w:ascii="Times New Roman" w:hAnsi="Times New Roman" w:cs="Times New Roman"/>
           <w:sz w:val="24"/>
         </w:rPr>
+        <w:t xml:space="preserve">Rekdal, O. B., &amp; Pettersen, B. I. A. (2025). </w:t>
+      </w:r>
+      <w:r>
+        <w:rPr>
+          <w:rFonts w:ascii="Times New Roman" w:hAnsi="Times New Roman" w:cs="Times New Roman"/>
+          <w:i/>
+          <w:sz w:val="24"/>
+        </w:rPr>
+        <w:t>Vitenskapelig skriving – en praktisk innføring</w:t>
+      </w:r>
+      <w:r>
+        <w:rPr>
+          <w:rFonts w:ascii="Times New Roman" w:hAnsi="Times New Roman" w:cs="Times New Roman"/>
+          <w:sz w:val="24"/>
+        </w:rPr>
+        <w:t xml:space="preserve"> [Upublisert undervisningsmateriell]. Høgskolen i Molde.</w:t>
+      </w:r>
+    </w:p>
+    <w:p>
+      <w:pPr>
+        <w:spacing w:line="360" w:lineRule="auto"/>
+      </w:pPr>
+      <w:r>
+        <w:rPr>
+          <w:rFonts w:ascii="Times New Roman" w:hAnsi="Times New Roman" w:cs="Times New Roman"/>
+          <w:sz w:val="24"/>
+        </w:rPr>
+        <w:t xml:space="preserve">Rousseeuw, P. J. (1987). Silhouettes: A graphical aid to the interpretation and validation of cluster analysis. </w:t>
+      </w:r>
+      <w:r>
+        <w:rPr>
+          <w:rFonts w:ascii="Times New Roman" w:hAnsi="Times New Roman" w:cs="Times New Roman"/>
+          <w:i/>
+          <w:sz w:val="24"/>
+        </w:rPr>
+        <w:t>Journal of Computational and Applied Mathematics</w:t>
+      </w:r>
+      <w:r>
+        <w:rPr>
+          <w:rFonts w:ascii="Times New Roman" w:hAnsi="Times New Roman" w:cs="Times New Roman"/>
+          <w:sz w:val="24"/>
+        </w:rPr>
+        <w:t xml:space="preserve">, </w:t>
+      </w:r>
+      <w:r>
+        <w:rPr>
+          <w:rFonts w:ascii="Times New Roman" w:hAnsi="Times New Roman" w:cs="Times New Roman"/>
+          <w:i/>
+          <w:sz w:val="24"/>
+        </w:rPr>
+        <w:t>20</w:t>
+      </w:r>
+      <w:r>
+        <w:rPr>
+          <w:rFonts w:ascii="Times New Roman" w:hAnsi="Times New Roman" w:cs="Times New Roman"/>
+          <w:sz w:val="24"/>
+        </w:rPr>
+        <w:t>, 53–65. https://doi.org/10.1016/0377-0427(87)90125-7</w:t>
+      </w:r>
+    </w:p>
+    <w:p>
+      <w:pPr>
+        <w:spacing w:line="360" w:lineRule="auto"/>
+      </w:pPr>
+      <w:r>
+        <w:rPr>
+          <w:rFonts w:ascii="Times New Roman" w:hAnsi="Times New Roman" w:cs="Times New Roman"/>
+          <w:sz w:val="24"/>
+        </w:rPr>
         <w:t xml:space="preserve">Saha, E., &amp; Ray, P. K. (2019). Modelling and analysis of inventory management systems in healthcare: A review and reflections. </w:t>
       </w:r>
       <w:r>
@@ -23341,87 +23644,6 @@
           <w:sz w:val="24"/>
         </w:rPr>
         <w:t>, 82–101. https://doi.org/10.1016/j.omega.2016.08.004</w:t>
-      </w:r>
-    </w:p>
-    <w:p>
-      <w:pPr>
-        <w:spacing w:line="360" w:lineRule="auto"/>
-      </w:pPr>
-      <w:r>
-        <w:rPr>
-          <w:rFonts w:ascii="Times New Roman" w:hAnsi="Times New Roman" w:cs="Times New Roman"/>
-          <w:sz w:val="24"/>
-        </w:rPr>
-        <w:t xml:space="preserve">Anthropic. (2026). </w:t>
-      </w:r>
-      <w:r>
-        <w:rPr>
-          <w:rFonts w:ascii="Times New Roman" w:hAnsi="Times New Roman" w:cs="Times New Roman"/>
-          <w:i/>
-          <w:sz w:val="24"/>
-        </w:rPr>
-        <w:t>Claude</w:t>
-      </w:r>
-      <w:r>
-        <w:rPr>
-          <w:rFonts w:ascii="Times New Roman" w:hAnsi="Times New Roman" w:cs="Times New Roman"/>
-          <w:sz w:val="24"/>
-        </w:rPr>
-        <w:t xml:space="preserve"> [Stor språkmodell]. https://claude.ai</w:t>
-      </w:r>
-    </w:p>
-    <w:p>
-      <w:pPr>
-        <w:spacing w:line="360" w:lineRule="auto"/>
-      </w:pPr>
-      <w:r>
-        <w:rPr>
-          <w:rFonts w:ascii="Times New Roman" w:hAnsi="Times New Roman" w:cs="Times New Roman"/>
-          <w:sz w:val="24"/>
-        </w:rPr>
-        <w:t xml:space="preserve">Helse Vest RHF. (2024). </w:t>
-      </w:r>
-      <w:r>
-        <w:rPr>
-          <w:rFonts w:ascii="Times New Roman" w:hAnsi="Times New Roman" w:cs="Times New Roman"/>
-          <w:i/>
-          <w:sz w:val="24"/>
-        </w:rPr>
-        <w:t>Kontraktstildeling: Drift av regionalt forsyningssenter</w:t>
-      </w:r>
-      <w:r>
-        <w:rPr>
-          <w:rFonts w:ascii="Times New Roman" w:hAnsi="Times New Roman" w:cs="Times New Roman"/>
-          <w:sz w:val="24"/>
-        </w:rPr>
-        <w:t xml:space="preserve"> [Kunngjøring om inngått kontrakt, kunngjøring 2024-101803]. Doffin – database for offentlige innkjøp. https://doffin.no/notices/2024-101803</w:t>
-      </w:r>
-    </w:p>
-    <w:p>
-      <w:pPr>
-        <w:spacing w:line="360" w:lineRule="auto"/>
-      </w:pPr>
-      <w:r>
-        <w:rPr>
-          <w:rFonts w:ascii="Times New Roman" w:hAnsi="Times New Roman" w:cs="Times New Roman"/>
-          <w:sz w:val="24"/>
-        </w:rPr>
-        <w:t xml:space="preserve">Rekdal, O. B., &amp; Pettersen, B. I. A. (2025). </w:t>
-      </w:r>
-      <w:r>
-        <w:rPr>
-          <w:rFonts w:ascii="Times New Roman" w:hAnsi="Times New Roman" w:cs="Times New Roman"/>
-          <w:i/>
-          <w:sz w:val="24"/>
-        </w:rPr>
-        <w:t>Vitenskapelig skriving – en praktisk innføring</w:t>
-      </w:r>
-      <w:r>
-        <w:rPr>
-          <w:rFonts w:ascii="Times New Roman" w:hAnsi="Times New Roman" w:cs="Times New Roman"/>
-          <w:sz w:val="24"/>
-        </w:rPr>
-        <w:t xml:space="preserve"> (9. des. 2025). Høgskolen i Molde.</w:t>
       </w:r>
     </w:p>
     <w:p>
@@ -23663,6 +23885,26 @@
           <w:sz w:val="24"/>
         </w:rPr>
         <w:t xml:space="preserve"> Claude ble brukt til å strukturere rapportteksten og forbedre språklig klarhet. Verktøyet foreslo disposisjon, avsnittsinndeling og formuleringer som forfatteren vurderte kritisk og reviderte. Alle faglige påstander, argumenter og konklusjoner er forfatterens egne. Claude er ikke brukt som fagkilde og er ikke sitert som belegg for faglige påstander.</w:t>
+      </w:r>
+    </w:p>
+    <w:p>
+      <w:pPr>
+        <w:spacing w:line="360" w:lineRule="auto"/>
+      </w:pPr>
+      <w:r>
+        <w:rPr>
+          <w:rFonts w:ascii="Times New Roman" w:hAnsi="Times New Roman" w:cs="Times New Roman"/>
+          <w:b/>
+          <w:sz w:val="24"/>
+        </w:rPr>
+        <w:t>4. Refleksjon over KI-brukens påvirkning.</w:t>
+      </w:r>
+      <w:r>
+        <w:rPr>
+          <w:rFonts w:ascii="Times New Roman" w:hAnsi="Times New Roman" w:cs="Times New Roman"/>
+          <w:sz w:val="24"/>
+        </w:rPr>
+        <w:t xml:space="preserve"> Bruken av Claude påvirket arbeidsprosessen på to vesentlige måter. For det første akselererte kodestøtten iterasjonshastigheten i Python-utviklingen, noe som muliggjorde flere eksperimentelle kjøringer og raskere feilsøking enn manuell utvikling alene ville tillatt. For det andre bidro den språklige bearbeidingen til mer konsise formuleringer, men krevde aktiv overvåking for å unngå at faglig presisjon gikk tapt til fordel for språklig eleganse. Den analytiske retningen — valg av metoder, regelutforming og tolkning av resultater — er ikke påvirket av KI-verktøyet.</w:t>
       </w:r>
     </w:p>
     <w:p>

</xml_diff>

<commit_message>
Rett KI-formalia, konklusjonsstyrke og K-means-posisjonering etter helhetsvurdering
- Endre seksjonstittel til «Bruk av kunstig intelligens» (retningslinjer kap. 4)
- Fjern Anthropic fra referanselisten (KI er ikke akademisk kilde)
- Fjern alle (Anthropic, 2026)-siteringer fra figurtekster og brødtekst
- Legg til signaturblokk i Vedlegg C for signert KI-erklæring
- Endre «lavest risiko for servicesvikt» til «lavest forbruksvariasjon» med krav om klinisk kritikalitetsvurdering
- Tone ned K-means fra «oppgavens metodiske bidrag» til «utforskende element»

Co-Authored-By: Claude Opus 4.6 (1M context) <noreply@anthropic.com>
</commit_message>
<xml_diff>
--- a/005 report/LOG650_Rapport.docx
+++ b/005 report/LOG650_Rapport.docx
@@ -5561,7 +5561,7 @@
           <w:rFonts w:ascii="Times New Roman" w:hAnsi="Times New Roman" w:cs="Times New Roman"/>
           <w:sz w:val="24"/>
         </w:rPr>
-        <w:t>Flerkriterietilnærminger som EDAS (Keshavarz Ghorabaee et al., 2015) krever subjektiv vekting, noe som svekker etterprøvbarheten. Denne oppgaven benytter derfor objektivt beregnbare kriterier (verdi, CV, EOQ-avvik). Klyngeanalyse representerer et datadrevet alternativ som fanger sammensatte mønstre uten forhåndsdefinerte terskelverdier (Srinivasan &amp; Moon, 1999). Kombinasjonen av K-means med regelbaserte beslutningssystemer er lite dokumentert i sykehuskontekst, og utgjør oppgavens metodiske bidrag.</w:t>
+        <w:t>Flerkriterietilnærminger som EDAS (Keshavarz Ghorabaee et al., 2015) krever subjektiv vekting, noe som svekker etterprøvbarheten. Denne oppgaven benytter derfor objektivt beregnbare kriterier (verdi, CV, EOQ-avvik). Klyngeanalyse representerer et datadrevet alternativ som fanger sammensatte mønstre uten forhåndsdefinerte terskelverdier (Srinivasan &amp; Moon, 1999). Kombinasjonen av K-means med regelbaserte beslutningssystemer er lite dokumentert i sykehuskontekst, og utgjør et utforskende element i oppgavens metoderammeverk.</w:t>
       </w:r>
     </w:p>
     <w:p>
@@ -7868,7 +7868,7 @@
           <w:i/>
           <w:sz w:val="20"/>
         </w:rPr>
-        <w:t>. Konseptuelt rammeverk – fra SAP-data til HVFS-anbefaling. Generert med støtte fra Claude (Anthropic, 2026).</w:t>
+        <w:t>. Konseptuelt rammeverk – fra SAP-data til HVFS-anbefaling. Generert med støtte fra Claude.</w:t>
       </w:r>
     </w:p>
     <w:p>
@@ -8687,7 +8687,7 @@
           <w:i/>
           <w:sz w:val="20"/>
         </w:rPr>
-        <w:t>. Lagerstruktur – Helse Vest forsyningskjede (forenklet). Generert med støtte fra Claude (Anthropic, 2026).</w:t>
+        <w:t>. Lagerstruktur – Helse Vest forsyningskjede (forenklet). Generert med støtte fra Claude.</w:t>
       </w:r>
     </w:p>
     <w:p>
@@ -10059,7 +10059,7 @@
           <w:i/>
           <w:sz w:val="20"/>
         </w:rPr>
-        <w:t>. Dataoversikt: fordeling av nøkkelvariabler for 709 artikler ved WERKS 3300, LGORT 3001. Generert med støtte fra Claude (Anthropic, 2026).</w:t>
+        <w:t>. Dataoversikt: fordeling av nøkkelvariabler for 709 artikler ved WERKS 3300, LGORT 3001. Generert med støtte fra Claude.</w:t>
       </w:r>
     </w:p>
     <w:p>
@@ -10852,7 +10852,7 @@
           <w:i/>
           <w:sz w:val="20"/>
         </w:rPr>
-        <w:t>. Analysepipeline: fra SAP-rådata til HVFS-anbefaling. Generert med støtte fra Claude (Anthropic, 2026).</w:t>
+        <w:t>. Analysepipeline: fra SAP-rådata til HVFS-anbefaling. Generert med støtte fra Claude.</w:t>
       </w:r>
     </w:p>
     <w:p>
@@ -10917,7 +10917,7 @@
           <w:color w:val="000000"/>
           <w:sz w:val="32"/>
         </w:rPr>
-        <w:t>4.5 Bruk av KI-verktøy</w:t>
+        <w:t>4.5 Bruk av kunstig intelligens</w:t>
       </w:r>
     </w:p>
     <w:p>
@@ -10930,7 +10930,7 @@
           <w:rFonts w:ascii="Times New Roman" w:hAnsi="Times New Roman" w:cs="Times New Roman"/>
           <w:sz w:val="24"/>
         </w:rPr>
-        <w:t>Kunstig intelligens i form av store språkmodeller ble benyttet som faglig støtteverktøy gjennom hele prosjektperioden, i tråd med retningslinjene i kursets skrivekompendium (Rekdal &amp; Pettersen, 2025). Claude (Anthropic, 2026) ble anvendt til kodestøtte, generering av datavisualiseringer og språklig bearbeiding av rapportteksten. KI-verktøyet er ikke brukt som fagkilde og er ikke sitert som belegg for faglige påstander. All KI-generert kode og tekst er kritisk gjennomgått og revidert av forfatteren; en refleksjon over KI-brukens påvirkning på arbeidsprosessen er gitt i Vedlegg C.</w:t>
+        <w:t>Kunstig intelligens i form av store språkmodeller ble benyttet som faglig støtteverktøy gjennom hele prosjektperioden, i tråd med retningslinjene i kursets skrivekompendium (Rekdal &amp; Pettersen, 2025). Claude ble anvendt til kodestøtte, generering av datavisualiseringer og språklig bearbeiding av rapportteksten. KI-verktøyet er ikke brukt som fagkilde og er ikke sitert som belegg for faglige påstander. All KI-generert kode og tekst er kritisk gjennomgått og revidert av forfatteren; en refleksjon over KI-brukens påvirkning på arbeidsprosessen er gitt i Vedlegg C.</w:t>
       </w:r>
     </w:p>
     <w:p>
@@ -11839,7 +11839,7 @@
                 <w:b w:val="0"/>
                 <w:sz w:val="22"/>
               </w:rPr>
-              <w:t>Kelle et al. (2012); Bijvank &amp; Vis (2012)</w:t>
+              <w:t>Bijvank &amp; Vis (2012); Kelle et al. (2012)</w:t>
             </w:r>
           </w:p>
         </w:tc>
@@ -15174,7 +15174,7 @@
           <w:i/>
           <w:sz w:val="20"/>
         </w:rPr>
-        <w:t>. Regelmotor: sekvensiell beslutningsflyt for HVFS-anbefaling (R1–R8). Generert med støtte fra Claude (Anthropic, 2026).</w:t>
+        <w:t>. Regelmotor: sekvensiell beslutningsflyt for HVFS-anbefaling (R1–R8). Generert med støtte fra Claude.</w:t>
       </w:r>
     </w:p>
     <w:p>
@@ -15458,7 +15458,7 @@
           <w:i/>
           <w:sz w:val="20"/>
         </w:rPr>
-        <w:t>. ABC Pareto-kurve: kumulativ verdiandel for 709 artikler rangert etter årsverdi, med grenser ved 80 % (A/B) og 95 % (B/C). Generert med støtte fra Claude (Anthropic, 2026).</w:t>
+        <w:t>. ABC Pareto-kurve: kumulativ verdiandel for 709 artikler rangert etter årsverdi, med grenser ved 80 % (A/B) og 95 % (B/C). Generert med støtte fra Claude.</w:t>
       </w:r>
     </w:p>
     <w:p>
@@ -15719,7 +15719,7 @@
           <w:i/>
           <w:sz w:val="20"/>
         </w:rPr>
-        <w:t>. ABC/XYZ-kryssmatrise: antall artikler per kombinasjon (687 klassifiserte artikler, WERKS 3300 / LGORT 3001). Generert med støtte fra Claude (Anthropic, 2026).</w:t>
+        <w:t>. ABC/XYZ-kryssmatrise: antall artikler per kombinasjon (687 klassifiserte artikler, WERKS 3300 / LGORT 3001). Generert med støtte fra Claude.</w:t>
       </w:r>
     </w:p>
     <w:p>
@@ -16211,7 +16211,7 @@
           <w:i/>
           <w:sz w:val="20"/>
         </w:rPr>
-        <w:t>. EOQ-avvik: relativ frekvensavvik (FREQ_AVVIK) for artikler med tilstrekkelige data, med terskel ved τ_f = 1,5. Generert med støtte fra Claude (Anthropic, 2026).</w:t>
+        <w:t>. EOQ-avvik: relativ frekvensavvik (FREQ_AVVIK) for artikler med tilstrekkelige data, med terskel ved τ_f = 1,5. Generert med støtte fra Claude.</w:t>
       </w:r>
     </w:p>
     <w:p>
@@ -16521,7 +16521,7 @@
           <w:i/>
           <w:sz w:val="20"/>
         </w:rPr>
-        <w:t>. Silhouette-score for K = 2–7 (treningsdata, n = 389): K = 3 gir høyest score (0,383). Generert med støtte fra Claude (Anthropic, 2026).</w:t>
+        <w:t>. Silhouette-score for K = 2–7 (treningsdata, n = 389): K = 3 gir høyest score (0,383). Generert med støtte fra Claude.</w:t>
       </w:r>
     </w:p>
     <w:p>
@@ -16703,7 +16703,7 @@
           <w:i/>
           <w:sz w:val="20"/>
         </w:rPr>
-        <w:t>. K-means klyngeresultat (K = 3): artikler plottet langs z(ln CV) og z(ln verdi), farge etter klynge. K_OVERFØR-klyngen er markert med stjerne (★). Generert med støtte fra Claude (Anthropic, 2026).</w:t>
+        <w:t>. K-means klyngeresultat (K = 3): artikler plottet langs z(ln CV) og z(ln verdi), farge etter klynge. K_OVERFØR-klyngen er markert med stjerne (★). Generert med støtte fra Claude.</w:t>
       </w:r>
     </w:p>
     <w:p>
@@ -16793,7 +16793,7 @@
           <w:i/>
           <w:sz w:val="20"/>
         </w:rPr>
-        <w:t>. Klyngeprofiler for K-means (K=3): gjennomsnittlig z-score per feature per klynge. K\_OVERFØR-klyngen (grønn) kjennetegnes av lav CV og høy verdi. Generert med støtte fra Claude (Anthropic, 2026).</w:t>
+        <w:t>. Klyngeprofiler for K-means (K=3): gjennomsnittlig z-score per feature per klynge. K\_OVERFØR-klyngen (grønn) kjennetegnes av lav CV og høy verdi. Generert med støtte fra Claude.</w:t>
       </w:r>
     </w:p>
     <w:p>
@@ -17118,7 +17118,7 @@
           <w:i/>
           <w:sz w:val="20"/>
         </w:rPr>
-        <w:t>. Regelmotor og besparelsesanalyse: fordeling av HVFS-anbefalinger (venstre) og estimert årlig EOQ-besparelse under tre realiseringsscenarier (høyre). 709 artikler, WERKS 3300 / LGORT 3001. Generert med støtte fra Claude (Anthropic, 2026).</w:t>
+        <w:t>. Regelmotor og besparelsesanalyse: fordeling av HVFS-anbefalinger (venstre) og estimert årlig EOQ-besparelse under tre realiseringsscenarier (høyre). 709 artikler, WERKS 3300 / LGORT 3001. Generert med støtte fra Claude.</w:t>
       </w:r>
     </w:p>
     <w:p>
@@ -22418,7 +22418,7 @@
           <w:rFonts w:ascii="Times New Roman" w:hAnsi="Times New Roman" w:cs="Times New Roman"/>
           <w:sz w:val="24"/>
         </w:rPr>
-        <w:t>De 145 artiklene som er identifisert som prioriterte overføringskandidater bør ikke overføres samlet i én operasjon. En pilotfase bør prioritere artiklene i skjæringspunktet mellom K_OVERFØR-klyngen og AX/BX-kategoriene, da disse har den sterkeste kombinasjonen av analysesignaler og lavest risiko for servicesvikt. En gradvis overføring gir mulighet til å verifisere at HVFS og NorEngros håndterer artiklene i henhold til APL-leveransemodellen før hele porteføljen flyttes.</w:t>
+        <w:t>De 145 artiklene som er identifisert som prioriterte overføringskandidater bør ikke overføres samlet i én operasjon. En pilotfase bør prioritere artiklene i skjæringspunktet mellom K_OVERFØR-klyngen og AX/BX-kategoriene, da disse har den sterkeste kombinasjonen av analysesignaler og lavest forbruksvariasjon. Pilotvalideringen bør suppleres med en klinisk kritikalitetsvurdering (jf. avsnitt 8.4) for å sikre at ingen artikler med høy pasientrisiko overføres uten tilstrekkelig forsyningssikkerhet. En gradvis overføring gir mulighet til å verifisere at HVFS og NorEngros håndterer artiklene i henhold til APL-leveransemodellen før hele porteføljen flyttes.</w:t>
       </w:r>
     </w:p>
     <w:p>
@@ -22598,7 +22598,7 @@
           <w:rFonts w:ascii="Times New Roman" w:hAnsi="Times New Roman" w:cs="Times New Roman"/>
           <w:sz w:val="24"/>
         </w:rPr>
-        <w:t xml:space="preserve">Anthropic. (2026). </w:t>
+        <w:t xml:space="preserve">Bijvank, M., &amp; Vis, I. F. A. (2012). Inventory control for point-of-use locations in hospitals. </w:t>
       </w:r>
       <w:r>
         <w:rPr>
@@ -22606,14 +22606,29 @@
           <w:i/>
           <w:sz w:val="24"/>
         </w:rPr>
-        <w:t>Claude</w:t>
-      </w:r>
-      <w:r>
-        <w:rPr>
-          <w:rFonts w:ascii="Times New Roman" w:hAnsi="Times New Roman" w:cs="Times New Roman"/>
-          <w:sz w:val="24"/>
-        </w:rPr>
-        <w:t xml:space="preserve"> [Stor språkmodell]. https://claude.ai</w:t>
+        <w:t>Journal of the Operational Research Society</w:t>
+      </w:r>
+      <w:r>
+        <w:rPr>
+          <w:rFonts w:ascii="Times New Roman" w:hAnsi="Times New Roman" w:cs="Times New Roman"/>
+          <w:sz w:val="24"/>
+        </w:rPr>
+        <w:t xml:space="preserve">, </w:t>
+      </w:r>
+      <w:r>
+        <w:rPr>
+          <w:rFonts w:ascii="Times New Roman" w:hAnsi="Times New Roman" w:cs="Times New Roman"/>
+          <w:i/>
+          <w:sz w:val="24"/>
+        </w:rPr>
+        <w:t>63</w:t>
+      </w:r>
+      <w:r>
+        <w:rPr>
+          <w:rFonts w:ascii="Times New Roman" w:hAnsi="Times New Roman" w:cs="Times New Roman"/>
+          <w:sz w:val="24"/>
+        </w:rPr>
+        <w:t>(4), 497–510. https://doi.org/10.1057/jors.2011.52</w:t>
       </w:r>
     </w:p>
     <w:p>
@@ -22627,7 +22642,7 @@
           <w:rFonts w:ascii="Times New Roman" w:hAnsi="Times New Roman" w:cs="Times New Roman"/>
           <w:sz w:val="24"/>
         </w:rPr>
-        <w:t xml:space="preserve">Bijvank, M., &amp; Vis, I. F. A. (2012). Inventory control for point-of-use locations in hospitals. </w:t>
+        <w:t xml:space="preserve">de Vries, J. (2011). The shaping of inventory systems in health services: A stakeholder analysis. </w:t>
       </w:r>
       <w:r>
         <w:rPr>
@@ -22635,7 +22650,7 @@
           <w:i/>
           <w:sz w:val="24"/>
         </w:rPr>
-        <w:t>Journal of the Operational Research Society</w:t>
+        <w:t>International Journal of Production Economics</w:t>
       </w:r>
       <w:r>
         <w:rPr>
@@ -22650,14 +22665,14 @@
           <w:i/>
           <w:sz w:val="24"/>
         </w:rPr>
-        <w:t>63</w:t>
-      </w:r>
-      <w:r>
-        <w:rPr>
-          <w:rFonts w:ascii="Times New Roman" w:hAnsi="Times New Roman" w:cs="Times New Roman"/>
-          <w:sz w:val="24"/>
-        </w:rPr>
-        <w:t>(4), 497–510. https://doi.org/10.1057/jors.2011.52</w:t>
+        <w:t>133</w:t>
+      </w:r>
+      <w:r>
+        <w:rPr>
+          <w:rFonts w:ascii="Times New Roman" w:hAnsi="Times New Roman" w:cs="Times New Roman"/>
+          <w:sz w:val="24"/>
+        </w:rPr>
+        <w:t>(1), 60–69. https://doi.org/10.1016/j.ijpe.2009.10.029</w:t>
       </w:r>
     </w:p>
     <w:p>
@@ -22671,7 +22686,7 @@
           <w:rFonts w:ascii="Times New Roman" w:hAnsi="Times New Roman" w:cs="Times New Roman"/>
           <w:sz w:val="24"/>
         </w:rPr>
-        <w:t xml:space="preserve">de Vries, J. (2011). The shaping of inventory systems in health services: A stakeholder analysis. </w:t>
+        <w:t xml:space="preserve">Fragapane, G. I., Bertnum, A. B., Hvolby, H.-H., &amp; Strandhagen, J. O. (2019). Medical supplies to the point-of-use in hospitals. I </w:t>
       </w:r>
       <w:r>
         <w:rPr>
@@ -22679,29 +22694,14 @@
           <w:i/>
           <w:sz w:val="24"/>
         </w:rPr>
-        <w:t>International Journal of Production Economics</w:t>
-      </w:r>
-      <w:r>
-        <w:rPr>
-          <w:rFonts w:ascii="Times New Roman" w:hAnsi="Times New Roman" w:cs="Times New Roman"/>
-          <w:sz w:val="24"/>
-        </w:rPr>
-        <w:t xml:space="preserve">, </w:t>
-      </w:r>
-      <w:r>
-        <w:rPr>
-          <w:rFonts w:ascii="Times New Roman" w:hAnsi="Times New Roman" w:cs="Times New Roman"/>
-          <w:i/>
-          <w:sz w:val="24"/>
-        </w:rPr>
-        <w:t>133</w:t>
-      </w:r>
-      <w:r>
-        <w:rPr>
-          <w:rFonts w:ascii="Times New Roman" w:hAnsi="Times New Roman" w:cs="Times New Roman"/>
-          <w:sz w:val="24"/>
-        </w:rPr>
-        <w:t>(1), 60–69. https://doi.org/10.1016/j.ijpe.2009.10.029</w:t>
+        <w:t>IFIP International Conference on Advances in Production Management Systems (APMS)</w:t>
+      </w:r>
+      <w:r>
+        <w:rPr>
+          <w:rFonts w:ascii="Times New Roman" w:hAnsi="Times New Roman" w:cs="Times New Roman"/>
+          <w:sz w:val="24"/>
+        </w:rPr>
+        <w:t xml:space="preserve"> (s. 248–255). Springer. https://doi.org/10.1007/978-3-030-29996-5_29</w:t>
       </w:r>
     </w:p>
     <w:p>
@@ -22715,7 +22715,7 @@
           <w:rFonts w:ascii="Times New Roman" w:hAnsi="Times New Roman" w:cs="Times New Roman"/>
           <w:sz w:val="24"/>
         </w:rPr>
-        <w:t xml:space="preserve">Fragapane, G. I., Bertnum, A. B., Hvolby, H.-H., &amp; Strandhagen, J. O. (2019). Medical supplies to the point-of-use in hospitals. I </w:t>
+        <w:t xml:space="preserve">Gupta, R., Gupta, K. K., Jain, B. R., &amp; Garg, R. K. (2007). ABC and VED analysis in medical stores inventory control. </w:t>
       </w:r>
       <w:r>
         <w:rPr>
@@ -22723,14 +22723,29 @@
           <w:i/>
           <w:sz w:val="24"/>
         </w:rPr>
-        <w:t>IFIP International Conference on Advances in Production Management Systems (APMS)</w:t>
-      </w:r>
-      <w:r>
-        <w:rPr>
-          <w:rFonts w:ascii="Times New Roman" w:hAnsi="Times New Roman" w:cs="Times New Roman"/>
-          <w:sz w:val="24"/>
-        </w:rPr>
-        <w:t xml:space="preserve"> (s. 248–255). Springer. https://doi.org/10.1007/978-3-030-29996-5_29</w:t>
+        <w:t>Medical Journal Armed Forces India</w:t>
+      </w:r>
+      <w:r>
+        <w:rPr>
+          <w:rFonts w:ascii="Times New Roman" w:hAnsi="Times New Roman" w:cs="Times New Roman"/>
+          <w:sz w:val="24"/>
+        </w:rPr>
+        <w:t xml:space="preserve">, </w:t>
+      </w:r>
+      <w:r>
+        <w:rPr>
+          <w:rFonts w:ascii="Times New Roman" w:hAnsi="Times New Roman" w:cs="Times New Roman"/>
+          <w:i/>
+          <w:sz w:val="24"/>
+        </w:rPr>
+        <w:t>63</w:t>
+      </w:r>
+      <w:r>
+        <w:rPr>
+          <w:rFonts w:ascii="Times New Roman" w:hAnsi="Times New Roman" w:cs="Times New Roman"/>
+          <w:sz w:val="24"/>
+        </w:rPr>
+        <w:t>(4), 325–327. https://doi.org/10.1016/S0377-1237(07)80005-2</w:t>
       </w:r>
     </w:p>
     <w:p>
@@ -22744,7 +22759,7 @@
           <w:rFonts w:ascii="Times New Roman" w:hAnsi="Times New Roman" w:cs="Times New Roman"/>
           <w:sz w:val="24"/>
         </w:rPr>
-        <w:t xml:space="preserve">Gupta, R., Gupta, K. K., Jain, B. R., &amp; Garg, R. K. (2007). ABC and VED analysis in medical stores inventory control. </w:t>
+        <w:t xml:space="preserve">Gurumurthy, A., Nair, V. K., &amp; Vinodh, S. (2021). Application of a hybrid selective inventory control technique in a hospital: A precursor for inventory reduction through lean thinking. </w:t>
       </w:r>
       <w:r>
         <w:rPr>
@@ -22752,7 +22767,7 @@
           <w:i/>
           <w:sz w:val="24"/>
         </w:rPr>
-        <w:t>Medical Journal Armed Forces India</w:t>
+        <w:t>The TQM Journal</w:t>
       </w:r>
       <w:r>
         <w:rPr>
@@ -22767,14 +22782,14 @@
           <w:i/>
           <w:sz w:val="24"/>
         </w:rPr>
-        <w:t>63</w:t>
-      </w:r>
-      <w:r>
-        <w:rPr>
-          <w:rFonts w:ascii="Times New Roman" w:hAnsi="Times New Roman" w:cs="Times New Roman"/>
-          <w:sz w:val="24"/>
-        </w:rPr>
-        <w:t>(4), 325–327. https://doi.org/10.1016/S0377-1237(07)80005-2</w:t>
+        <w:t>33</w:t>
+      </w:r>
+      <w:r>
+        <w:rPr>
+          <w:rFonts w:ascii="Times New Roman" w:hAnsi="Times New Roman" w:cs="Times New Roman"/>
+          <w:sz w:val="24"/>
+        </w:rPr>
+        <w:t>(3), 568–595. https://doi.org/10.1108/TQM-06-2020-0123</w:t>
       </w:r>
     </w:p>
     <w:p>
@@ -22788,7 +22803,7 @@
           <w:rFonts w:ascii="Times New Roman" w:hAnsi="Times New Roman" w:cs="Times New Roman"/>
           <w:sz w:val="24"/>
         </w:rPr>
-        <w:t xml:space="preserve">Gurumurthy, A., Nair, V. K., &amp; Vinodh, S. (2021). Application of a hybrid selective inventory control technique in a hospital: A precursor for inventory reduction through lean thinking. </w:t>
+        <w:t xml:space="preserve">Hautaniemi, P., &amp; Pirttilä, T. (1999). The choice of replenishment policies in an MRP environment. </w:t>
       </w:r>
       <w:r>
         <w:rPr>
@@ -22796,7 +22811,7 @@
           <w:i/>
           <w:sz w:val="24"/>
         </w:rPr>
-        <w:t>The TQM Journal</w:t>
+        <w:t>International Journal of Production Economics</w:t>
       </w:r>
       <w:r>
         <w:rPr>
@@ -22811,14 +22826,14 @@
           <w:i/>
           <w:sz w:val="24"/>
         </w:rPr>
-        <w:t>33</w:t>
-      </w:r>
-      <w:r>
-        <w:rPr>
-          <w:rFonts w:ascii="Times New Roman" w:hAnsi="Times New Roman" w:cs="Times New Roman"/>
-          <w:sz w:val="24"/>
-        </w:rPr>
-        <w:t>(3), 568–595. https://doi.org/10.1108/TQM-06-2020-0123</w:t>
+        <w:t>59</w:t>
+      </w:r>
+      <w:r>
+        <w:rPr>
+          <w:rFonts w:ascii="Times New Roman" w:hAnsi="Times New Roman" w:cs="Times New Roman"/>
+          <w:sz w:val="24"/>
+        </w:rPr>
+        <w:t>(1–3), 85–92. https://doi.org/10.1016/S0925-5273(98)00026-7</w:t>
       </w:r>
     </w:p>
     <w:p>
@@ -22832,7 +22847,7 @@
           <w:rFonts w:ascii="Times New Roman" w:hAnsi="Times New Roman" w:cs="Times New Roman"/>
           <w:sz w:val="24"/>
         </w:rPr>
-        <w:t xml:space="preserve">Hautaniemi, P., &amp; Pirttilä, T. (1999). The choice of replenishment policies in an MRP environment. </w:t>
+        <w:t xml:space="preserve">Helse Vest RHF. (2024). </w:t>
       </w:r>
       <w:r>
         <w:rPr>
@@ -22840,29 +22855,14 @@
           <w:i/>
           <w:sz w:val="24"/>
         </w:rPr>
-        <w:t>International Journal of Production Economics</w:t>
-      </w:r>
-      <w:r>
-        <w:rPr>
-          <w:rFonts w:ascii="Times New Roman" w:hAnsi="Times New Roman" w:cs="Times New Roman"/>
-          <w:sz w:val="24"/>
-        </w:rPr>
-        <w:t xml:space="preserve">, </w:t>
-      </w:r>
-      <w:r>
-        <w:rPr>
-          <w:rFonts w:ascii="Times New Roman" w:hAnsi="Times New Roman" w:cs="Times New Roman"/>
-          <w:i/>
-          <w:sz w:val="24"/>
-        </w:rPr>
-        <w:t>59</w:t>
-      </w:r>
-      <w:r>
-        <w:rPr>
-          <w:rFonts w:ascii="Times New Roman" w:hAnsi="Times New Roman" w:cs="Times New Roman"/>
-          <w:sz w:val="24"/>
-        </w:rPr>
-        <w:t>(1–3), 85–92. https://doi.org/10.1016/S0925-5273(98)00026-7</w:t>
+        <w:t>Kontraktstildeling: Drift av regionalt forsyningssenter</w:t>
+      </w:r>
+      <w:r>
+        <w:rPr>
+          <w:rFonts w:ascii="Times New Roman" w:hAnsi="Times New Roman" w:cs="Times New Roman"/>
+          <w:sz w:val="24"/>
+        </w:rPr>
+        <w:t xml:space="preserve"> [Kunngjøring om inngått kontrakt, kunngjøring 2024-101803]. Doffin – database for offentlige innkjøp. https://doffin.no/notices/2024-101803</w:t>
       </w:r>
     </w:p>
     <w:p>
@@ -22876,7 +22876,7 @@
           <w:rFonts w:ascii="Times New Roman" w:hAnsi="Times New Roman" w:cs="Times New Roman"/>
           <w:sz w:val="24"/>
         </w:rPr>
-        <w:t xml:space="preserve">Helse Vest RHF. (2024). </w:t>
+        <w:t xml:space="preserve">Kelle, P., Woosley, J., &amp; Schneider, H. (2012). Pharmaceutical supply chain specifics and inventory solutions for a hospital case. </w:t>
       </w:r>
       <w:r>
         <w:rPr>
@@ -22884,14 +22884,29 @@
           <w:i/>
           <w:sz w:val="24"/>
         </w:rPr>
-        <w:t>Kontraktstildeling: Drift av regionalt forsyningssenter</w:t>
-      </w:r>
-      <w:r>
-        <w:rPr>
-          <w:rFonts w:ascii="Times New Roman" w:hAnsi="Times New Roman" w:cs="Times New Roman"/>
-          <w:sz w:val="24"/>
-        </w:rPr>
-        <w:t xml:space="preserve"> [Kunngjøring om inngått kontrakt, kunngjøring 2024-101803]. Doffin – database for offentlige innkjøp. https://doffin.no/notices/2024-101803</w:t>
+        <w:t>Operations Research for Health Care</w:t>
+      </w:r>
+      <w:r>
+        <w:rPr>
+          <w:rFonts w:ascii="Times New Roman" w:hAnsi="Times New Roman" w:cs="Times New Roman"/>
+          <w:sz w:val="24"/>
+        </w:rPr>
+        <w:t xml:space="preserve">, </w:t>
+      </w:r>
+      <w:r>
+        <w:rPr>
+          <w:rFonts w:ascii="Times New Roman" w:hAnsi="Times New Roman" w:cs="Times New Roman"/>
+          <w:i/>
+          <w:sz w:val="24"/>
+        </w:rPr>
+        <w:t>1</w:t>
+      </w:r>
+      <w:r>
+        <w:rPr>
+          <w:rFonts w:ascii="Times New Roman" w:hAnsi="Times New Roman" w:cs="Times New Roman"/>
+          <w:sz w:val="24"/>
+        </w:rPr>
+        <w:t>(2–3), 54–63. https://doi.org/10.1016/j.orhc.2012.07.001</w:t>
       </w:r>
     </w:p>
     <w:p>
@@ -22905,7 +22920,7 @@
           <w:rFonts w:ascii="Times New Roman" w:hAnsi="Times New Roman" w:cs="Times New Roman"/>
           <w:sz w:val="24"/>
         </w:rPr>
-        <w:t xml:space="preserve">Kelle, P., Woosley, J., &amp; Schneider, H. (2012). Pharmaceutical supply chain specifics and inventory solutions for a hospital case. </w:t>
+        <w:t xml:space="preserve">Keshavarz Ghorabaee, M., Zavadskas, E. K., Olfat, L., &amp; Turskis, Z. (2015). Multi-criteria inventory classification using a new method of evaluation based on distance from average solution (EDAS). </w:t>
       </w:r>
       <w:r>
         <w:rPr>
@@ -22913,7 +22928,7 @@
           <w:i/>
           <w:sz w:val="24"/>
         </w:rPr>
-        <w:t>Operations Research for Health Care</w:t>
+        <w:t>Informatica</w:t>
       </w:r>
       <w:r>
         <w:rPr>
@@ -22928,14 +22943,14 @@
           <w:i/>
           <w:sz w:val="24"/>
         </w:rPr>
-        <w:t>1</w:t>
-      </w:r>
-      <w:r>
-        <w:rPr>
-          <w:rFonts w:ascii="Times New Roman" w:hAnsi="Times New Roman" w:cs="Times New Roman"/>
-          <w:sz w:val="24"/>
-        </w:rPr>
-        <w:t>(2–3), 54–63. https://doi.org/10.1016/j.orhc.2012.07.001</w:t>
+        <w:t>26</w:t>
+      </w:r>
+      <w:r>
+        <w:rPr>
+          <w:rFonts w:ascii="Times New Roman" w:hAnsi="Times New Roman" w:cs="Times New Roman"/>
+          <w:sz w:val="24"/>
+        </w:rPr>
+        <w:t>(3), 435–451. https://doi.org/10.15388/Informatica.2015.57</w:t>
       </w:r>
     </w:p>
     <w:p>
@@ -22949,7 +22964,7 @@
           <w:rFonts w:ascii="Times New Roman" w:hAnsi="Times New Roman" w:cs="Times New Roman"/>
           <w:sz w:val="24"/>
         </w:rPr>
-        <w:t xml:space="preserve">Keshavarz Ghorabaee, M., Zavadskas, E. K., Olfat, L., &amp; Turskis, Z. (2015). Multi-criteria inventory classification using a new method of evaluation based on distance from average solution (EDAS). </w:t>
+        <w:t xml:space="preserve">Ketkar, M., &amp; Vaidya, O. S. (2014). Developing ordering policy based on multiple inventory classification schemes. </w:t>
       </w:r>
       <w:r>
         <w:rPr>
@@ -22957,7 +22972,7 @@
           <w:i/>
           <w:sz w:val="24"/>
         </w:rPr>
-        <w:t>Informatica</w:t>
+        <w:t>Procedia – Social and Behavioral Sciences</w:t>
       </w:r>
       <w:r>
         <w:rPr>
@@ -22972,14 +22987,14 @@
           <w:i/>
           <w:sz w:val="24"/>
         </w:rPr>
-        <w:t>26</w:t>
-      </w:r>
-      <w:r>
-        <w:rPr>
-          <w:rFonts w:ascii="Times New Roman" w:hAnsi="Times New Roman" w:cs="Times New Roman"/>
-          <w:sz w:val="24"/>
-        </w:rPr>
-        <w:t>(3), 435–451. https://doi.org/10.15388/Informatica.2015.57</w:t>
+        <w:t>133</w:t>
+      </w:r>
+      <w:r>
+        <w:rPr>
+          <w:rFonts w:ascii="Times New Roman" w:hAnsi="Times New Roman" w:cs="Times New Roman"/>
+          <w:sz w:val="24"/>
+        </w:rPr>
+        <w:t>, 180–188. https://doi.org/10.1016/j.sbspro.2014.04.183</w:t>
       </w:r>
     </w:p>
     <w:p>
@@ -22993,7 +23008,7 @@
           <w:rFonts w:ascii="Times New Roman" w:hAnsi="Times New Roman" w:cs="Times New Roman"/>
           <w:sz w:val="24"/>
         </w:rPr>
-        <w:t xml:space="preserve">Ketkar, M., &amp; Vaidya, O. S. (2014). Developing ordering policy based on multiple inventory classification schemes. </w:t>
+        <w:t xml:space="preserve">McKinney, W. (2010). Data structures for statistical computing in Python. I S. van der Walt &amp; J. Millman (Red.), </w:t>
       </w:r>
       <w:r>
         <w:rPr>
@@ -23001,29 +23016,14 @@
           <w:i/>
           <w:sz w:val="24"/>
         </w:rPr>
-        <w:t>Procedia – Social and Behavioral Sciences</w:t>
-      </w:r>
-      <w:r>
-        <w:rPr>
-          <w:rFonts w:ascii="Times New Roman" w:hAnsi="Times New Roman" w:cs="Times New Roman"/>
-          <w:sz w:val="24"/>
-        </w:rPr>
-        <w:t xml:space="preserve">, </w:t>
-      </w:r>
-      <w:r>
-        <w:rPr>
-          <w:rFonts w:ascii="Times New Roman" w:hAnsi="Times New Roman" w:cs="Times New Roman"/>
-          <w:i/>
-          <w:sz w:val="24"/>
-        </w:rPr>
-        <w:t>133</w:t>
-      </w:r>
-      <w:r>
-        <w:rPr>
-          <w:rFonts w:ascii="Times New Roman" w:hAnsi="Times New Roman" w:cs="Times New Roman"/>
-          <w:sz w:val="24"/>
-        </w:rPr>
-        <w:t>, 180–188. https://doi.org/10.1016/j.sbspro.2014.04.183</w:t>
+        <w:t>Proceedings of the 9th Python in Science Conference</w:t>
+      </w:r>
+      <w:r>
+        <w:rPr>
+          <w:rFonts w:ascii="Times New Roman" w:hAnsi="Times New Roman" w:cs="Times New Roman"/>
+          <w:sz w:val="24"/>
+        </w:rPr>
+        <w:t xml:space="preserve"> (s. 56–61). https://doi.org/10.25080/Majora-92bf1922-00a</w:t>
       </w:r>
     </w:p>
     <w:p>
@@ -23037,7 +23037,7 @@
           <w:rFonts w:ascii="Times New Roman" w:hAnsi="Times New Roman" w:cs="Times New Roman"/>
           <w:sz w:val="24"/>
         </w:rPr>
-        <w:t xml:space="preserve">McKinney, W. (2010). Data structures for statistical computing in Python. I S. van der Walt &amp; J. Millman (Red.), </w:t>
+        <w:t xml:space="preserve">Moons, K., Waeyenbergh, G., &amp; Pintelon, L. (2019). Measuring the logistics performance of internal hospital supply chains – A literature study. </w:t>
       </w:r>
       <w:r>
         <w:rPr>
@@ -23045,14 +23045,29 @@
           <w:i/>
           <w:sz w:val="24"/>
         </w:rPr>
-        <w:t>Proceedings of the 9th Python in Science Conference</w:t>
-      </w:r>
-      <w:r>
-        <w:rPr>
-          <w:rFonts w:ascii="Times New Roman" w:hAnsi="Times New Roman" w:cs="Times New Roman"/>
-          <w:sz w:val="24"/>
-        </w:rPr>
-        <w:t xml:space="preserve"> (s. 56–61). https://doi.org/10.25080/Majora-92bf1922-00a</w:t>
+        <w:t>Omega</w:t>
+      </w:r>
+      <w:r>
+        <w:rPr>
+          <w:rFonts w:ascii="Times New Roman" w:hAnsi="Times New Roman" w:cs="Times New Roman"/>
+          <w:sz w:val="24"/>
+        </w:rPr>
+        <w:t xml:space="preserve">, </w:t>
+      </w:r>
+      <w:r>
+        <w:rPr>
+          <w:rFonts w:ascii="Times New Roman" w:hAnsi="Times New Roman" w:cs="Times New Roman"/>
+          <w:i/>
+          <w:sz w:val="24"/>
+        </w:rPr>
+        <w:t>82</w:t>
+      </w:r>
+      <w:r>
+        <w:rPr>
+          <w:rFonts w:ascii="Times New Roman" w:hAnsi="Times New Roman" w:cs="Times New Roman"/>
+          <w:sz w:val="24"/>
+        </w:rPr>
+        <w:t>, 205–217. https://doi.org/10.1016/j.omega.2018.01.007</w:t>
       </w:r>
     </w:p>
     <w:p>
@@ -23066,7 +23081,7 @@
           <w:rFonts w:ascii="Times New Roman" w:hAnsi="Times New Roman" w:cs="Times New Roman"/>
           <w:sz w:val="24"/>
         </w:rPr>
-        <w:t xml:space="preserve">Moons, K., Waeyenbergh, G., &amp; Pintelon, L. (2019). Measuring the logistics performance of internal hospital supply chains – A literature study. </w:t>
+        <w:t xml:space="preserve">Nowotyńska, I. (2013). An application of XYZ analysis in company stock management. </w:t>
       </w:r>
       <w:r>
         <w:rPr>
@@ -23074,7 +23089,7 @@
           <w:i/>
           <w:sz w:val="24"/>
         </w:rPr>
-        <w:t>Omega</w:t>
+        <w:t>Modern Management Review</w:t>
       </w:r>
       <w:r>
         <w:rPr>
@@ -23089,14 +23104,14 @@
           <w:i/>
           <w:sz w:val="24"/>
         </w:rPr>
-        <w:t>82</w:t>
-      </w:r>
-      <w:r>
-        <w:rPr>
-          <w:rFonts w:ascii="Times New Roman" w:hAnsi="Times New Roman" w:cs="Times New Roman"/>
-          <w:sz w:val="24"/>
-        </w:rPr>
-        <w:t>, 205–217. https://doi.org/10.1016/j.omega.2018.01.007</w:t>
+        <w:t>XVIII</w:t>
+      </w:r>
+      <w:r>
+        <w:rPr>
+          <w:rFonts w:ascii="Times New Roman" w:hAnsi="Times New Roman" w:cs="Times New Roman"/>
+          <w:sz w:val="24"/>
+        </w:rPr>
+        <w:t>(20), 77–86.</w:t>
       </w:r>
     </w:p>
     <w:p>
@@ -23110,7 +23125,7 @@
           <w:rFonts w:ascii="Times New Roman" w:hAnsi="Times New Roman" w:cs="Times New Roman"/>
           <w:sz w:val="24"/>
         </w:rPr>
-        <w:t xml:space="preserve">Nowotyńska, I. (2013). An application of XYZ analysis in company stock management. </w:t>
+        <w:t xml:space="preserve">Partovi, F. Y., &amp; Burton, J. (1993). Using the analytic hierarchy process for ABC analysis. </w:t>
       </w:r>
       <w:r>
         <w:rPr>
@@ -23118,7 +23133,7 @@
           <w:i/>
           <w:sz w:val="24"/>
         </w:rPr>
-        <w:t>Modern Management Review</w:t>
+        <w:t>International Journal of Operations and Production Management</w:t>
       </w:r>
       <w:r>
         <w:rPr>
@@ -23133,14 +23148,14 @@
           <w:i/>
           <w:sz w:val="24"/>
         </w:rPr>
-        <w:t>XVIII</w:t>
-      </w:r>
-      <w:r>
-        <w:rPr>
-          <w:rFonts w:ascii="Times New Roman" w:hAnsi="Times New Roman" w:cs="Times New Roman"/>
-          <w:sz w:val="24"/>
-        </w:rPr>
-        <w:t>(20), 77–86.</w:t>
+        <w:t>13</w:t>
+      </w:r>
+      <w:r>
+        <w:rPr>
+          <w:rFonts w:ascii="Times New Roman" w:hAnsi="Times New Roman" w:cs="Times New Roman"/>
+          <w:sz w:val="24"/>
+        </w:rPr>
+        <w:t>(9), 29–44. https://doi.org/10.1108/01443579310043619</w:t>
       </w:r>
     </w:p>
     <w:p>
@@ -23154,7 +23169,7 @@
           <w:rFonts w:ascii="Times New Roman" w:hAnsi="Times New Roman" w:cs="Times New Roman"/>
           <w:sz w:val="24"/>
         </w:rPr>
-        <w:t xml:space="preserve">Partovi, F. Y., &amp; Burton, J. (1993). Using the analytic hierarchy process for ABC analysis. </w:t>
+        <w:t xml:space="preserve">Pedregosa, F., Varoquaux, G., Gramfort, A., Michel, V., Thirion, B., Grisel, O., Blondel, M., Prettenhofer, P., Weiss, R., Dubourg, V., Vanderplas, J., Passos, A., Cournapeau, D., Brucher, M., Perrot, M., &amp; Duchesnay, É. (2011). Scikit-learn: Machine learning in Python. </w:t>
       </w:r>
       <w:r>
         <w:rPr>
@@ -23162,7 +23177,7 @@
           <w:i/>
           <w:sz w:val="24"/>
         </w:rPr>
-        <w:t>International Journal of Operations and Production Management</w:t>
+        <w:t>Journal of Machine Learning Research</w:t>
       </w:r>
       <w:r>
         <w:rPr>
@@ -23177,14 +23192,14 @@
           <w:i/>
           <w:sz w:val="24"/>
         </w:rPr>
-        <w:t>13</w:t>
-      </w:r>
-      <w:r>
-        <w:rPr>
-          <w:rFonts w:ascii="Times New Roman" w:hAnsi="Times New Roman" w:cs="Times New Roman"/>
-          <w:sz w:val="24"/>
-        </w:rPr>
-        <w:t>(9), 29–44. https://doi.org/10.1108/01443579310043619</w:t>
+        <w:t>12</w:t>
+      </w:r>
+      <w:r>
+        <w:rPr>
+          <w:rFonts w:ascii="Times New Roman" w:hAnsi="Times New Roman" w:cs="Times New Roman"/>
+          <w:sz w:val="24"/>
+        </w:rPr>
+        <w:t>, 2825–2830. https://jmlr.org/papers/v12/pedregosa11a.html</w:t>
       </w:r>
     </w:p>
     <w:p>
@@ -23198,7 +23213,7 @@
           <w:rFonts w:ascii="Times New Roman" w:hAnsi="Times New Roman" w:cs="Times New Roman"/>
           <w:sz w:val="24"/>
         </w:rPr>
-        <w:t xml:space="preserve">Pedregosa, F., Varoquaux, G., Gramfort, A., Michel, V., Thirion, B., Grisel, O., Blondel, M., Prettenhofer, P., Weiss, R., Dubourg, V., Vanderplas, J., Passos, A., Cournapeau, D., Brucher, M., Perrot, M., &amp; Duchesnay, É. (2011). Scikit-learn: Machine learning in Python. </w:t>
+        <w:t xml:space="preserve">Pujawan, I. N. (2004). The effect of lot sizing rules on order variability. </w:t>
       </w:r>
       <w:r>
         <w:rPr>
@@ -23206,7 +23221,7 @@
           <w:i/>
           <w:sz w:val="24"/>
         </w:rPr>
-        <w:t>Journal of Machine Learning Research</w:t>
+        <w:t>European Journal of Operational Research</w:t>
       </w:r>
       <w:r>
         <w:rPr>
@@ -23221,14 +23236,14 @@
           <w:i/>
           <w:sz w:val="24"/>
         </w:rPr>
-        <w:t>12</w:t>
-      </w:r>
-      <w:r>
-        <w:rPr>
-          <w:rFonts w:ascii="Times New Roman" w:hAnsi="Times New Roman" w:cs="Times New Roman"/>
-          <w:sz w:val="24"/>
-        </w:rPr>
-        <w:t>, 2825–2830. https://jmlr.org/papers/v12/pedregosa11a.html</w:t>
+        <w:t>159</w:t>
+      </w:r>
+      <w:r>
+        <w:rPr>
+          <w:rFonts w:ascii="Times New Roman" w:hAnsi="Times New Roman" w:cs="Times New Roman"/>
+          <w:sz w:val="24"/>
+        </w:rPr>
+        <w:t>(3), 617–635. https://doi.org/10.1016/S0377-2217(03)00419-3</w:t>
       </w:r>
     </w:p>
     <w:p>
@@ -23242,7 +23257,7 @@
           <w:rFonts w:ascii="Times New Roman" w:hAnsi="Times New Roman" w:cs="Times New Roman"/>
           <w:sz w:val="24"/>
         </w:rPr>
-        <w:t xml:space="preserve">Pujawan, I. N. (2004). The effect of lot sizing rules on order variability. </w:t>
+        <w:t xml:space="preserve">Rekdal, O. B., &amp; Pettersen, B. I. A. (2025). </w:t>
       </w:r>
       <w:r>
         <w:rPr>
@@ -23250,29 +23265,14 @@
           <w:i/>
           <w:sz w:val="24"/>
         </w:rPr>
-        <w:t>European Journal of Operational Research</w:t>
-      </w:r>
-      <w:r>
-        <w:rPr>
-          <w:rFonts w:ascii="Times New Roman" w:hAnsi="Times New Roman" w:cs="Times New Roman"/>
-          <w:sz w:val="24"/>
-        </w:rPr>
-        <w:t xml:space="preserve">, </w:t>
-      </w:r>
-      <w:r>
-        <w:rPr>
-          <w:rFonts w:ascii="Times New Roman" w:hAnsi="Times New Roman" w:cs="Times New Roman"/>
-          <w:i/>
-          <w:sz w:val="24"/>
-        </w:rPr>
-        <w:t>159</w:t>
-      </w:r>
-      <w:r>
-        <w:rPr>
-          <w:rFonts w:ascii="Times New Roman" w:hAnsi="Times New Roman" w:cs="Times New Roman"/>
-          <w:sz w:val="24"/>
-        </w:rPr>
-        <w:t>(3), 617–635. https://doi.org/10.1016/S0377-2217(03)00419-3</w:t>
+        <w:t>Vitenskapelig skriving – en praktisk innføring</w:t>
+      </w:r>
+      <w:r>
+        <w:rPr>
+          <w:rFonts w:ascii="Times New Roman" w:hAnsi="Times New Roman" w:cs="Times New Roman"/>
+          <w:sz w:val="24"/>
+        </w:rPr>
+        <w:t xml:space="preserve"> [Upublisert undervisningsmateriell]. Høgskolen i Molde.</w:t>
       </w:r>
     </w:p>
     <w:p>
@@ -23286,7 +23286,7 @@
           <w:rFonts w:ascii="Times New Roman" w:hAnsi="Times New Roman" w:cs="Times New Roman"/>
           <w:sz w:val="24"/>
         </w:rPr>
-        <w:t xml:space="preserve">Rekdal, O. B., &amp; Pettersen, B. I. A. (2025). </w:t>
+        <w:t xml:space="preserve">Rousseeuw, P. J. (1987). Silhouettes: A graphical aid to the interpretation and validation of cluster analysis. </w:t>
       </w:r>
       <w:r>
         <w:rPr>
@@ -23294,14 +23294,29 @@
           <w:i/>
           <w:sz w:val="24"/>
         </w:rPr>
-        <w:t>Vitenskapelig skriving – en praktisk innføring</w:t>
-      </w:r>
-      <w:r>
-        <w:rPr>
-          <w:rFonts w:ascii="Times New Roman" w:hAnsi="Times New Roman" w:cs="Times New Roman"/>
-          <w:sz w:val="24"/>
-        </w:rPr>
-        <w:t xml:space="preserve"> [Upublisert undervisningsmateriell]. Høgskolen i Molde.</w:t>
+        <w:t>Journal of Computational and Applied Mathematics</w:t>
+      </w:r>
+      <w:r>
+        <w:rPr>
+          <w:rFonts w:ascii="Times New Roman" w:hAnsi="Times New Roman" w:cs="Times New Roman"/>
+          <w:sz w:val="24"/>
+        </w:rPr>
+        <w:t xml:space="preserve">, </w:t>
+      </w:r>
+      <w:r>
+        <w:rPr>
+          <w:rFonts w:ascii="Times New Roman" w:hAnsi="Times New Roman" w:cs="Times New Roman"/>
+          <w:i/>
+          <w:sz w:val="24"/>
+        </w:rPr>
+        <w:t>20</w:t>
+      </w:r>
+      <w:r>
+        <w:rPr>
+          <w:rFonts w:ascii="Times New Roman" w:hAnsi="Times New Roman" w:cs="Times New Roman"/>
+          <w:sz w:val="24"/>
+        </w:rPr>
+        <w:t>, 53–65. https://doi.org/10.1016/0377-0427(87)90125-7</w:t>
       </w:r>
     </w:p>
     <w:p>
@@ -23315,7 +23330,7 @@
           <w:rFonts w:ascii="Times New Roman" w:hAnsi="Times New Roman" w:cs="Times New Roman"/>
           <w:sz w:val="24"/>
         </w:rPr>
-        <w:t xml:space="preserve">Rousseeuw, P. J. (1987). Silhouettes: A graphical aid to the interpretation and validation of cluster analysis. </w:t>
+        <w:t xml:space="preserve">Saha, E., &amp; Ray, P. K. (2019). Modelling and analysis of inventory management systems in healthcare: A review and reflections. </w:t>
       </w:r>
       <w:r>
         <w:rPr>
@@ -23323,7 +23338,7 @@
           <w:i/>
           <w:sz w:val="24"/>
         </w:rPr>
-        <w:t>Journal of Computational and Applied Mathematics</w:t>
+        <w:t>Computers &amp; Industrial Engineering</w:t>
       </w:r>
       <w:r>
         <w:rPr>
@@ -23338,14 +23353,14 @@
           <w:i/>
           <w:sz w:val="24"/>
         </w:rPr>
-        <w:t>20</w:t>
-      </w:r>
-      <w:r>
-        <w:rPr>
-          <w:rFonts w:ascii="Times New Roman" w:hAnsi="Times New Roman" w:cs="Times New Roman"/>
-          <w:sz w:val="24"/>
-        </w:rPr>
-        <w:t>, 53–65. https://doi.org/10.1016/0377-0427(87)90125-7</w:t>
+        <w:t>137</w:t>
+      </w:r>
+      <w:r>
+        <w:rPr>
+          <w:rFonts w:ascii="Times New Roman" w:hAnsi="Times New Roman" w:cs="Times New Roman"/>
+          <w:sz w:val="24"/>
+        </w:rPr>
+        <w:t>, 106051. https://doi.org/10.1016/j.cie.2019.106051</w:t>
       </w:r>
     </w:p>
     <w:p>
@@ -23359,7 +23374,7 @@
           <w:rFonts w:ascii="Times New Roman" w:hAnsi="Times New Roman" w:cs="Times New Roman"/>
           <w:sz w:val="24"/>
         </w:rPr>
-        <w:t xml:space="preserve">Saha, E., &amp; Ray, P. K. (2019). Modelling and analysis of inventory management systems in healthcare: A review and reflections. </w:t>
+        <w:t xml:space="preserve">Silaen, B. R., Nasution, M., &amp; Muti'ah, R. (2023). Implementation of the ABC analysis to the inventory management. </w:t>
       </w:r>
       <w:r>
         <w:rPr>
@@ -23367,7 +23382,7 @@
           <w:i/>
           <w:sz w:val="24"/>
         </w:rPr>
-        <w:t>Computers &amp; Industrial Engineering</w:t>
+        <w:t>International Journal of Science, Technology &amp; Management</w:t>
       </w:r>
       <w:r>
         <w:rPr>
@@ -23382,14 +23397,14 @@
           <w:i/>
           <w:sz w:val="24"/>
         </w:rPr>
-        <w:t>137</w:t>
-      </w:r>
-      <w:r>
-        <w:rPr>
-          <w:rFonts w:ascii="Times New Roman" w:hAnsi="Times New Roman" w:cs="Times New Roman"/>
-          <w:sz w:val="24"/>
-        </w:rPr>
-        <w:t>, 106051. https://doi.org/10.1016/j.cie.2019.106051</w:t>
+        <w:t>4</w:t>
+      </w:r>
+      <w:r>
+        <w:rPr>
+          <w:rFonts w:ascii="Times New Roman" w:hAnsi="Times New Roman" w:cs="Times New Roman"/>
+          <w:sz w:val="24"/>
+        </w:rPr>
+        <w:t>(4), 815–822. https://doi.org/10.46729/ijstm.v4i4.886</w:t>
       </w:r>
     </w:p>
     <w:p>
@@ -23403,7 +23418,7 @@
           <w:rFonts w:ascii="Times New Roman" w:hAnsi="Times New Roman" w:cs="Times New Roman"/>
           <w:sz w:val="24"/>
         </w:rPr>
-        <w:t xml:space="preserve">Silaen, B. R., Nasution, M., &amp; Muti'ah, R. (2023). Implementation of the ABC analysis to the inventory management. </w:t>
+        <w:t xml:space="preserve">Srinivasan, M., &amp; Moon, Y. B. (1999). A comprehensive clustering algorithm for strategic analysis of supply chain networks. </w:t>
       </w:r>
       <w:r>
         <w:rPr>
@@ -23411,7 +23426,7 @@
           <w:i/>
           <w:sz w:val="24"/>
         </w:rPr>
-        <w:t>International Journal of Science, Technology &amp; Management</w:t>
+        <w:t>Computers &amp; Industrial Engineering</w:t>
       </w:r>
       <w:r>
         <w:rPr>
@@ -23426,14 +23441,14 @@
           <w:i/>
           <w:sz w:val="24"/>
         </w:rPr>
-        <w:t>4</w:t>
-      </w:r>
-      <w:r>
-        <w:rPr>
-          <w:rFonts w:ascii="Times New Roman" w:hAnsi="Times New Roman" w:cs="Times New Roman"/>
-          <w:sz w:val="24"/>
-        </w:rPr>
-        <w:t>(4), 815–822. https://doi.org/10.46729/ijstm.v4i4.886</w:t>
+        <w:t>36</w:t>
+      </w:r>
+      <w:r>
+        <w:rPr>
+          <w:rFonts w:ascii="Times New Roman" w:hAnsi="Times New Roman" w:cs="Times New Roman"/>
+          <w:sz w:val="24"/>
+        </w:rPr>
+        <w:t>, 615–633. https://doi.org/10.1016/S0360-8352(99)00155-2</w:t>
       </w:r>
     </w:p>
     <w:p>
@@ -23447,7 +23462,7 @@
           <w:rFonts w:ascii="Times New Roman" w:hAnsi="Times New Roman" w:cs="Times New Roman"/>
           <w:sz w:val="24"/>
         </w:rPr>
-        <w:t xml:space="preserve">Srinivasan, M., &amp; Moon, Y. B. (1999). A comprehensive clustering algorithm for strategic analysis of supply chain networks. </w:t>
+        <w:t xml:space="preserve">Suryaputri, Z., Gabriel, D. S., &amp; Nurcahyo, R. (2022). Integration of ABC-XYZ analysis in inventory management optimization: A case study in the health industry. I </w:t>
       </w:r>
       <w:r>
         <w:rPr>
@@ -23455,29 +23470,14 @@
           <w:i/>
           <w:sz w:val="24"/>
         </w:rPr>
-        <w:t>Computers &amp; Industrial Engineering</w:t>
-      </w:r>
-      <w:r>
-        <w:rPr>
-          <w:rFonts w:ascii="Times New Roman" w:hAnsi="Times New Roman" w:cs="Times New Roman"/>
-          <w:sz w:val="24"/>
-        </w:rPr>
-        <w:t xml:space="preserve">, </w:t>
-      </w:r>
-      <w:r>
-        <w:rPr>
-          <w:rFonts w:ascii="Times New Roman" w:hAnsi="Times New Roman" w:cs="Times New Roman"/>
-          <w:i/>
-          <w:sz w:val="24"/>
-        </w:rPr>
-        <w:t>36</w:t>
-      </w:r>
-      <w:r>
-        <w:rPr>
-          <w:rFonts w:ascii="Times New Roman" w:hAnsi="Times New Roman" w:cs="Times New Roman"/>
-          <w:sz w:val="24"/>
-        </w:rPr>
-        <w:t>, 615–633. https://doi.org/10.1016/S0360-8352(99)00155-2</w:t>
+        <w:t>Proceedings of the International Conference on Industrial Engineering and Operations Management</w:t>
+      </w:r>
+      <w:r>
+        <w:rPr>
+          <w:rFonts w:ascii="Times New Roman" w:hAnsi="Times New Roman" w:cs="Times New Roman"/>
+          <w:sz w:val="24"/>
+        </w:rPr>
+        <w:t xml:space="preserve"> (s. 351–360). IEOM Society International.</w:t>
       </w:r>
     </w:p>
     <w:p>
@@ -23491,7 +23491,7 @@
           <w:rFonts w:ascii="Times New Roman" w:hAnsi="Times New Roman" w:cs="Times New Roman"/>
           <w:sz w:val="24"/>
         </w:rPr>
-        <w:t xml:space="preserve">Suryaputri, Z., Gabriel, D. S., &amp; Nurcahyo, R. (2022). Integration of ABC-XYZ analysis in inventory management optimization: A case study in the health industry. I </w:t>
+        <w:t xml:space="preserve">van Kampen, T. J., Akkerman, R., &amp; van Donk, D. P. (2012). SKU classification: A literature review and conceptual framework. </w:t>
       </w:r>
       <w:r>
         <w:rPr>
@@ -23499,14 +23499,29 @@
           <w:i/>
           <w:sz w:val="24"/>
         </w:rPr>
-        <w:t>Proceedings of the International Conference on Industrial Engineering and Operations Management</w:t>
-      </w:r>
-      <w:r>
-        <w:rPr>
-          <w:rFonts w:ascii="Times New Roman" w:hAnsi="Times New Roman" w:cs="Times New Roman"/>
-          <w:sz w:val="24"/>
-        </w:rPr>
-        <w:t xml:space="preserve"> (s. 351–360). IEOM Society International.</w:t>
+        <w:t>International Journal of Operations and Production Management</w:t>
+      </w:r>
+      <w:r>
+        <w:rPr>
+          <w:rFonts w:ascii="Times New Roman" w:hAnsi="Times New Roman" w:cs="Times New Roman"/>
+          <w:sz w:val="24"/>
+        </w:rPr>
+        <w:t xml:space="preserve">, </w:t>
+      </w:r>
+      <w:r>
+        <w:rPr>
+          <w:rFonts w:ascii="Times New Roman" w:hAnsi="Times New Roman" w:cs="Times New Roman"/>
+          <w:i/>
+          <w:sz w:val="24"/>
+        </w:rPr>
+        <w:t>32</w:t>
+      </w:r>
+      <w:r>
+        <w:rPr>
+          <w:rFonts w:ascii="Times New Roman" w:hAnsi="Times New Roman" w:cs="Times New Roman"/>
+          <w:sz w:val="24"/>
+        </w:rPr>
+        <w:t>(7), 850–876. https://doi.org/10.1108/01443571211250112</w:t>
       </w:r>
     </w:p>
     <w:p>
@@ -23520,50 +23535,6 @@
           <w:rFonts w:ascii="Times New Roman" w:hAnsi="Times New Roman" w:cs="Times New Roman"/>
           <w:sz w:val="24"/>
         </w:rPr>
-        <w:t xml:space="preserve">van Kampen, T. J., Akkerman, R., &amp; van Donk, D. P. (2012). SKU classification: A literature review and conceptual framework. </w:t>
-      </w:r>
-      <w:r>
-        <w:rPr>
-          <w:rFonts w:ascii="Times New Roman" w:hAnsi="Times New Roman" w:cs="Times New Roman"/>
-          <w:i/>
-          <w:sz w:val="24"/>
-        </w:rPr>
-        <w:t>International Journal of Operations and Production Management</w:t>
-      </w:r>
-      <w:r>
-        <w:rPr>
-          <w:rFonts w:ascii="Times New Roman" w:hAnsi="Times New Roman" w:cs="Times New Roman"/>
-          <w:sz w:val="24"/>
-        </w:rPr>
-        <w:t xml:space="preserve">, </w:t>
-      </w:r>
-      <w:r>
-        <w:rPr>
-          <w:rFonts w:ascii="Times New Roman" w:hAnsi="Times New Roman" w:cs="Times New Roman"/>
-          <w:i/>
-          <w:sz w:val="24"/>
-        </w:rPr>
-        <w:t>32</w:t>
-      </w:r>
-      <w:r>
-        <w:rPr>
-          <w:rFonts w:ascii="Times New Roman" w:hAnsi="Times New Roman" w:cs="Times New Roman"/>
-          <w:sz w:val="24"/>
-        </w:rPr>
-        <w:t>(7), 850–876. https://doi.org/10.1108/01443571211250112</w:t>
-      </w:r>
-    </w:p>
-    <w:p>
-      <w:pPr>
-        <w:spacing w:line="240" w:lineRule="auto" w:after="120"/>
-        <w:ind w:left="720" w:hanging="720"/>
-        <w:jc w:val="both"/>
-      </w:pPr>
-      <w:r>
-        <w:rPr>
-          <w:rFonts w:ascii="Times New Roman" w:hAnsi="Times New Roman" w:cs="Times New Roman"/>
-          <w:sz w:val="24"/>
-        </w:rPr>
         <w:t xml:space="preserve">Volland, J., Fügener, A., Schoenfelder, J., &amp; Brunner, J. O. (2017). Material logistics in hospitals: A literature review. </w:t>
       </w:r>
       <w:r>
@@ -23828,7 +23799,7 @@
           <w:rFonts w:ascii="Times New Roman" w:hAnsi="Times New Roman" w:cs="Times New Roman"/>
           <w:sz w:val="24"/>
         </w:rPr>
-        <w:t>I denne rapporten er KI-verktøyet Claude (Anthropic, 2026) brukt som støtteverktøy i tre deler av arbeidet, i samsvar med Høgskolen i Molde sine retningslinjer for bruk av KI på hjemmeeksamen.</w:t>
+        <w:t>I denne rapporten er KI-verktøyet Claude brukt som støtteverktøy i tre deler av arbeidet, i samsvar med Høgskolen i Molde sine retningslinjer for bruk av KI på hjemmeeksamen.</w:t>
       </w:r>
     </w:p>
     <w:p>
@@ -23900,7 +23871,7 @@
           <w:rFonts w:ascii="Times New Roman" w:hAnsi="Times New Roman" w:cs="Times New Roman"/>
           <w:sz w:val="24"/>
         </w:rPr>
-        <w:t xml:space="preserve"> Alle 12 figurer (Fig00–Fig11) er generert med matplotlib-scripts der Claude bidro til utforming av layout, fargepalett og aksetitler. Figurene er basert på analyseresultater produsert av Python-scriptet fra SAP-kildedata – KI-verktøyet har ikke produsert eller modifisert noen dataverdier. Hver figur er merket «Generert med støtte fra Claude (Anthropic, 2026)» i bildeteksten. Tabeller er formatert med støtte fra Claude, men alle verdier kommer direkte fra analysescriptet.</w:t>
+        <w:t xml:space="preserve"> Alle 12 figurer (Fig00–Fig11) er generert med matplotlib-scripts der Claude bidro til utforming av layout, fargepalett og aksetitler. Figurene er basert på analyseresultater produsert av Python-scriptet fra SAP-kildedata – KI-verktøyet har ikke produsert eller modifisert noen dataverdier. Hver figur er merket «Generert med støtte fra Claude» i bildeteksten. Tabeller er formatert med støtte fra Claude, men alle verdier kommer direkte fra analysescriptet.</w:t>
       </w:r>
     </w:p>
     <w:p>
@@ -23964,6 +23935,72 @@
           <w:sz w:val="24"/>
         </w:rPr>
         <w:t xml:space="preserve"> Rådata fra SAP ble ikke lagt inn i KI-verktøyet. Alle datatransformasjoner er dokumentert i D-01–D-08 (avsnitt 4.3) og kjørt lokalt i Python. Ingen pasientdata eller personopplysninger er brukt i studien.</w:t>
+      </w:r>
+    </w:p>
+    <w:p>
+      <w:pPr>
+        <w:spacing w:line="360" w:lineRule="auto"/>
+        <w:jc w:val="both"/>
+      </w:pPr>
+      <w:r>
+        <w:rPr>
+          <w:rFonts w:ascii="Times New Roman" w:hAnsi="Times New Roman" w:cs="Times New Roman"/>
+          <w:b/>
+          <w:sz w:val="24"/>
+        </w:rPr>
+        <w:t>Signatur:</w:t>
+      </w:r>
+    </w:p>
+    <w:p>
+      <w:pPr>
+        <w:spacing w:line="360" w:lineRule="auto"/>
+        <w:jc w:val="both"/>
+      </w:pPr>
+      <w:r>
+        <w:rPr>
+          <w:rFonts w:ascii="Times New Roman" w:hAnsi="Times New Roman" w:cs="Times New Roman"/>
+          <w:sz w:val="24"/>
+        </w:rPr>
+        <w:t>Sted og dato: \_\_\_\_\_\_\_\_\_\_\_\_\_\_\_\_\_\_\_\_\_\_\_\_</w:t>
+      </w:r>
+    </w:p>
+    <w:p>
+      <w:pPr>
+        <w:spacing w:line="360" w:lineRule="auto"/>
+        <w:jc w:val="both"/>
+      </w:pPr>
+      <w:r>
+        <w:rPr>
+          <w:rFonts w:ascii="Times New Roman" w:hAnsi="Times New Roman" w:cs="Times New Roman"/>
+          <w:sz w:val="24"/>
+        </w:rPr>
+        <w:t>Navn: \_\_\_\_\_\_\_\_\_\_\_\_\_\_\_\_\_\_\_\_\_\_\_\_</w:t>
+      </w:r>
+    </w:p>
+    <w:p>
+      <w:pPr>
+        <w:spacing w:line="360" w:lineRule="auto"/>
+        <w:jc w:val="both"/>
+      </w:pPr>
+      <w:r>
+        <w:rPr>
+          <w:rFonts w:ascii="Times New Roman" w:hAnsi="Times New Roman" w:cs="Times New Roman"/>
+          <w:sz w:val="24"/>
+        </w:rPr>
+        <w:t>Studentnummer: \_\_\_\_\_\_\_\_\_\_\_\_\_\_\_\_\_\_\_\_\_\_\_\_</w:t>
+      </w:r>
+    </w:p>
+    <w:p>
+      <w:pPr>
+        <w:spacing w:line="360" w:lineRule="auto"/>
+        <w:jc w:val="both"/>
+      </w:pPr>
+      <w:r>
+        <w:rPr>
+          <w:rFonts w:ascii="Times New Roman" w:hAnsi="Times New Roman" w:cs="Times New Roman"/>
+          <w:sz w:val="24"/>
+        </w:rPr>
+        <w:t>Jeg bekrefter at opplysningene ovenfor er korrekte, og at all bruk av kunstig intelligens i dette arbeidet er beskrevet fullstendig og ærlig.</w:t>
       </w:r>
     </w:p>
     <w:sectPr>

</xml_diff>

<commit_message>
Rett nynorsk til bokmål i tre figurskript og regenerer figurer
Rettet synlig nynorsk i figurtekst: «kandidatar»→«kandidater»,
«nærmare»→«nærmere», «artiklar»→«artikler», «Einingspris»→«Enhetspris»,
«anbefalingar»→«anbefalinger», «årleg»→«årlig» m.fl. Berørte skript:
plot_abc_xyz_matrise.py, plot_dataoversikt.py, plot_regelmotor_besparelse.py.
Regenerert Fig04, Fig06 og Fig11. Bygget Word-dokument på nytt.

Co-Authored-By: Claude Opus 4.6 (1M context) <noreply@anthropic.com>
</commit_message>
<xml_diff>
--- a/005 report/LOG650_Rapport.docx
+++ b/005 report/LOG650_Rapport.docx
@@ -4607,7 +4607,7 @@
           <w:rFonts w:ascii="Times New Roman" w:hAnsi="Times New Roman"/>
           <w:sz w:val="24"/>
         </w:rPr>
-        <w:t xml:space="preserve">Denne studien analyserer hvilke artikler ved Helse Bergens forsyningslager (WERKS 3300, LGORT 3001) som bør overføres til Helse Vest Forsyningssenter (HVFS), og estimerer tilhørende besparelsespotensial. Studien er forankret i LIBRA-prosjektet og har som mål å utvikle et datadrevet og reproduserbart beslutningsgrunnlag for sentralisering basert på SAP S/4HANA-data.</w:t>
+        <w:t xml:space="preserve">Denne studien analyserer hvilke artikler ved Helse Bergens forsyningslager (WERKS 3300, LGORT 3001) som er kandidater for overføring til Helse Vest Forsyningssenter (HVFS), og estimerer tilhørende besparelsespotensial. Studien er forankret i LIBRA-prosjektet og har som mål å utvikle et datadrevet og reproduserbart beslutningsgrunnlag for sentralisering basert på SAP S/4HANA-data.</w:t>
       </w:r>
     </w:p>
     <w:p>
@@ -4992,7 +4992,7 @@
           <w:b/>
           <w:sz w:val="24"/>
         </w:rPr>
-        <w:t>Hvordan kan multikriterieklassifisering og klyngeanalyse av SAP-transaksjonsdata identifisere hvilke artikler ved Helse Bergens forsyningslager (WERKS 3300, LGORT 3001) som bør overføres til Helse Vest Forsyningssenter, og hva er det estimerte besparelsespotensialet ved en slik overføring?</w:t>
+        <w:t>Hvordan kan multikriterieklassifisering og klyngeanalyse av SAP-transaksjonsdata identifisere hvilke artikler ved Helse Bergens forsyningslager (WERKS 3300, LGORT 3001) som er kandidater for overføring til Helse Vest Forsyningssenter, og hva er det estimerte besparelsespotensialet ved en slik overføring?</w:t>
       </w:r>
     </w:p>
     <w:p>
@@ -8765,7 +8765,7 @@
           <w:rFonts w:ascii="Times New Roman" w:hAnsi="Times New Roman" w:cs="Times New Roman"/>
           <w:sz w:val="24"/>
         </w:rPr>
-        <w:t>Helse Bergens forsyningslager mangler i dag et systematisk, datadrevet grunnlag for å avgjøre hvilke av lagerets artikler som bør overføres til HVFS. Beslutningene om sortimentstilhørighet treffes i stor grad basert på erfaring og skjønn, uten en strukturert analyse av verdi, forbruksmønster eller kostnadseffektiviteten ved nåværende bestillingspraksis.</w:t>
+        <w:t>Helse Bergens forsyningslager mangler i dag et systematisk, datadrevet grunnlag for å avgjøre hvilke av lagerets artikler som er aktuelle for overføring til HVFS. Beslutningene om sortimentstilhørighet treffes i stor grad basert på erfaring og skjønn, uten en strukturert analyse av verdi, forbruksmønster eller kostnadseffektiviteten ved nåværende bestillingspraksis.</w:t>
       </w:r>
     </w:p>
     <w:p>
@@ -8804,7 +8804,7 @@
           <w:rFonts w:ascii="Times New Roman" w:hAnsi="Times New Roman" w:cs="Times New Roman"/>
           <w:sz w:val="24"/>
         </w:rPr>
-        <w:t>Datapipelinen fra råuttrekk til analyseresultat er illustrert i Figur 4 (avsnitt 4.3). En sentral datakvalitetsutfordring er at enhetspris i MBEW (feltet STPRS) ikke er per stykk, men per prisenhet (PEINH), som ofte er 10 eller 100 for medisinsk forbruksmateriell. Korrekt enhetspris beregnes derfor som STPRS ÷ PEINH. I tillegg mangler 204 artikler innkjøpsdata fra EKPO i analyseperioden, noe som nødvendiggjør en alternativ verdiberegning basert på annualisert forbruk og enhetspris. Disse og øvrige datakvalitetsbeslutninger er dokumentert i kapittel 4.</w:t>
+        <w:t>Datapipelinen fra råuttrekk til analyseresultat er illustrert i Figur 4 (avsnitt 4.3). En sentral datakvalitetsutfordring er at enhetspris i MBEW (feltet STPRS) ikke er per stykk, men per prisenhet (PEINH), som ofte er 10 eller 100 for medisinsk forbruksmateriell. Korrekt enhetspris beregnes derfor som STPRS ÷ PEINH. I tillegg mangler 204 artikler innkjøpsdata fra EKPO i analyseperioden, noe som nødvendiggjør en alternativ verdiberegning basert på annualisert forbruk og enhetspris. Disse og øvrige datakvalitetsbeslutninger er dokumentert i kapittel 4. Datagrunnlaget og problemkonteksten som er beskrevet i dette kapittelet danner utgangspunktet for de metodiske valgene som presenteres i neste kapittel.</w:t>
       </w:r>
     </w:p>
     <w:p>
@@ -18094,7 +18094,7 @@
           <w:rFonts w:ascii="Times New Roman" w:hAnsi="Times New Roman" w:cs="Times New Roman"/>
           <w:sz w:val="24"/>
         </w:rPr>
-        <w:t>Sammenligningen med SAP-feltet ZZXYZ viste 33 % samsvar mellom systemregistrert og beregnet klasse (125 av 375 artikler med data i begge kilder). Valideringen er begrenset til de 375 artiklene der ZZXYZ-feltet er utfylt i MDMA; for de øvrige 334 artiklene mangler systemklassifisering. Tabell 10 oppsummerer kryssvalideringen. Det lave samsvaret på 33 % understreker at SAP-feltets ZZXYZ ikke er systematisk oppdatert og bør erstattes med beregnet CV-klasse som primær XYZ-indikator. ABC/XYZ-kryssmatrisen er presentert som Figur 7 i kapittel 6; fullstendige celleantall er gjengitt der.</w:t>
+        <w:t>Sammenligningen med SAP-feltet ZZXYZ viste 33 % samsvar mellom systemregistrert og beregnet klasse (125 av 375 artikler med data i begge kilder). Valideringen er begrenset til de 375 artiklene der ZZXYZ-feltet er utfylt i MDMA; for de øvrige 334 artiklene mangler systemklassifisering. Tabell 10 oppsummerer kryssvalideringen. Det lave samsvaret på 33 % kan forklares av tre faktorer: (1) ZZXYZ oppdateres via MRP-kjøring og kan basere seg på andre CV-terskler enn litteraturens standard (0,5/1,0); (2) beregningsperioden for ZZXYZ er ikke nødvendigvis sammenfallende med denne studiens 24-månedersperiode; og (3) feltet oppdateres kun for artikler med aktiv MRP-kjøring. Divergensen er mest slående for Z-kategorien: SAP klassifiserer kun 7 artikler som Z, mens den beregnede klassifiseringen gir 79 – SAP fanger dermed nesten ingen artikler med uregelmessig forbruk. Dette understreker at SAP-feltets ZZXYZ ikke er systematisk oppdatert og bør erstattes med beregnet CV-klasse som primær XYZ-indikator. ABC/XYZ-kryssmatrisen er presentert som Figur 7 i kapittel 6; fullstendige celleantall er gjengitt der.</w:t>
       </w:r>
     </w:p>
     <w:p>
@@ -21785,7 +21785,7 @@
           <w:rFonts w:ascii="Times New Roman" w:hAnsi="Times New Roman" w:cs="Times New Roman"/>
           <w:sz w:val="24"/>
         </w:rPr>
-        <w:t>Studien gjennomfører ingen ekstern validering av regelmotor-anbefalingene mot innkjøpsfaglig skjønn eller historiske overføringsbeslutninger. Dette er en anerkjent begrensning ved normative klassifiseringsmodeller, som van Kampen et al. (2012) påpeker at alltid innebærer en grad av normativt skjønn i regelutformingen som vanskelig lar seg verifisere rent kvantitativt. Manglende ekstern validering innebærer at regelmotoren bør betraktes som et strukturert beslutningsunderlag, ikke som en autorisert beslutning. En planlagt oppfølgingsfase ved Helse Bergen vil innebære faglig gjennomgang av OVERFØR-listen mot innkjøpsfaglig og klinisk kompetanse, noe som vil gi grunnlag for empirisk validering av modellens treffsikkerhet.</w:t>
+        <w:t>Studien gjennomfører ingen ekstern validering av regelmotor-anbefalingene mot innkjøpsfaglig skjønn eller historiske overføringsbeslutninger. Dette er en anerkjent begrensning ved normative klassifiseringsmodeller, som van Kampen et al. (2012) påpeker at alltid innebærer en grad av normativt skjønn i regelutformingen som vanskelig lar seg verifisere rent kvantitativt. Manglende ekstern validering innebærer at regelmotoren bør betraktes som et strukturert beslutningsunderlag, ikke som en autorisert beslutning. Konkret innebærer dette at vi ikke kan angi modellens presisjon (andel korrekte OVERFØR-anbefalinger) eller recall (andel faktisk egnede artikler som fanges opp). Fraværet skyldes at ingen historisk referanseklassifisering eksisterer ved Helse Bergen – det er nettopp dette gapet studien adresserer. Resultatene bør dermed tolkes som et førstegenerasjons beslutningsunderlag. En planlagt oppfølgingsfase ved Helse Bergen vil innebære faglig gjennomgang av OVERFØR-listen mot innkjøpsfaglig og klinisk kompetanse, noe som vil gi det første empiriske grunnlaget for å kalibrere regelmotoren.</w:t>
       </w:r>
     </w:p>
     <w:p>
@@ -21843,7 +21843,40 @@
           <w:rFonts w:ascii="Times New Roman" w:hAnsi="Times New Roman" w:cs="Times New Roman"/>
           <w:sz w:val="24"/>
         </w:rPr>
-        <w:t xml:space="preserve"> avvike fra Wilson-estimatet. Hautaniemi og Pirttilä (1999) påpeker at EOQ-baserte beregninger er mest pålitelige for artikler med lav variabilitet, noe som understøtter valget om å begrense analysen til X-klassen, men en formell stasjonaritetstest (f.eks. augmented Dickey–Fuller) ville styrket den interne validiteten ytterligere.</w:t>
+        <w:t xml:space="preserve"> avvike fra Wilson-estimatet. Hautaniemi og Pirttilä (1999) påpeker at EOQ-baserte beregninger er mest pålitelige for artikler med lav variabilitet, noe som understøtter valget om å begrense analysen til X-klassen, men en formell stasjonaritetstest (f.eks. augmented Dickey–Fuller) ville styrket den interne validiteten ytterligere. Et mitigerende argument er at X-artikler per definisjon har </w:t>
+      </w:r>
+      <m:oMath>
+        <m:r>
+          <m:t>CV&lt;0,5,</m:t>
+        </m:r>
+      </m:oMath>
+      <w:r>
+        <w:rPr>
+          <w:rFonts w:ascii="Times New Roman" w:hAnsi="Times New Roman" w:cs="Times New Roman"/>
+          <w:sz w:val="24"/>
+        </w:rPr>
+        <w:t xml:space="preserve"> noe som innebærer at etterspørselsvariansen er lav relativt til gjennomsnittet over den 24-månedersperioden analysen dekker. EOQ-avviksanalysens primære formål er dessuten relativ rangering av artikler etter kostnadsavvik, ikke eksakt kostnadsestimering – en systematisk feil i </w:t>
+      </w:r>
+      <m:oMath>
+        <m:sSup>
+          <m:e>
+            <m:r>
+              <m:t>f</m:t>
+            </m:r>
+          </m:e>
+          <m:sup>
+            <m:r>
+              <m:t>*</m:t>
+            </m:r>
+          </m:sup>
+        </m:sSup>
+      </m:oMath>
+      <w:r>
+        <w:rPr>
+          <w:rFonts w:ascii="Times New Roman" w:hAnsi="Times New Roman" w:cs="Times New Roman"/>
+          <w:sz w:val="24"/>
+        </w:rPr>
+        <w:t xml:space="preserve"> vil dermed i stor grad påvirke alle artikler proporsjonalt og bevare rangeringen.</w:t>
       </w:r>
     </w:p>
     <w:p>
@@ -22041,7 +22074,7 @@
           <w:rFonts w:ascii="Times New Roman" w:hAnsi="Times New Roman" w:cs="Times New Roman"/>
           <w:sz w:val="24"/>
         </w:rPr>
-        <w:t xml:space="preserve"> (base case) er en ekspertantagelse uten direkte empirisk belegg fra sykehuslogistikk, og representerer den viktigste enkeltusikkerheten i besparelsesestimatet. Tilsvarende er ordrekostnad </w:t>
+        <w:t xml:space="preserve"> (base case) er en ekspertantagelse uten direkte empirisk belegg fra sykehuslogistikk, og representerer den viktigste enkeltusikkerheten i besparelsesestimatet. Intervallet 50–100 % er valgt for å fange realistisk implementeringsfriksjon: tre-scenarioanalysen gjør usikkerheten eksplisitt og lar beslutningstaker vurdere robustheten. Ettersom estimatet kun fanger transaksjonskostnadsavviket og utelater kapitalbindingsgevinsten – som Kelle et al. (2012) anslår til 5–15 % av lagerverdien – vil den faktiske nettogevinsten sannsynligvis ligge høyere enn base case isolert sett tilsier, selv med moderat gevinstrealisering. Tilsvarende er ordrekostnad </w:t>
       </w:r>
       <m:oMath>
         <m:r>
@@ -22103,7 +22136,7 @@
           <w:rFonts w:ascii="Times New Roman" w:hAnsi="Times New Roman" w:cs="Times New Roman"/>
           <w:sz w:val="24"/>
         </w:rPr>
-        <w:t xml:space="preserve"> ville klyngestrukturen sett annerledes ut. Z-score-standardiseringen gir de tre featurene lik vekt – en normativ beslutning som påvirker klyngeresultatene. CV-koeffisienten har en kjent svakhet ved lavt forbruksvolum, der enkeltutleveringer kan gi kunstig høy eller lav CV. K-means-klyngens rolle i regelmotoren er begrenset: fordi K\_OVERFØR per definisjon er klyngen med lavest CV og høyest verdi, overlapper den i stor grad med artikler som allerede identifiseres via ABC/XYZ-reglene (R3). K-means fungerer dermed primært som et bekreftende støttefilter snarere enn som et uavhengig empirisk signal – en form for bekreftelsestendens som bør erkjennes.</w:t>
+        <w:t xml:space="preserve"> ville klyngestrukturen sett annerledes ut. Z-score-standardiseringen gir de tre featurene lik vekt – en normativ beslutning som påvirker klyngeresultatene. CV-koeffisienten har en kjent svakhet ved lavt forbruksvolum, der enkeltutleveringer kan gi kunstig høy eller lav CV. K-means-klyngens rolle i regelmotoren er begrenset: fordi K\_OVERFØR per definisjon er klyngen med lavest CV og høyest verdi, overlapper den i stor grad med artikler som allerede identifiseres via ABC/XYZ-reglene (R3). K-means fungerer dermed primært som et bekreftende støttefilter snarere enn som et uavhengig empirisk signal – en form for bekreftelsestendens som bør erkjennes. Den primære merverdien av K-means i denne studien er metodisk snarere enn empirisk: klyngeanalysen viser at en datadrevet, terskelfri segmentering konvergerer mot samme artikkelgrupper som den terskelbaserte ABC/XYZ-klassifiseringen, noe som styrker tilliten til at terskelvalgene (80/95 % for ABC, 0,5/1,0 for CV) ikke er vilkårlige for dette datasettet.</w:t>
       </w:r>
     </w:p>
     <w:p>
@@ -22116,7 +22149,7 @@
           <w:rFonts w:ascii="Times New Roman" w:hAnsi="Times New Roman" w:cs="Times New Roman"/>
           <w:sz w:val="24"/>
         </w:rPr>
-        <w:t>For 204 artikler uten EKPO-data er ABC-verdien beregnet fra D_ANNUAL × UNIT_PRICE. Dersom standardprisen avviker fra faktisk innkjøpspris, vil ABC-rangeringen for disse artiklene være upresis.</w:t>
+        <w:t>For 204 artikler uten EKPO-data er ABC-verdien beregnet fra D_ANNUAL × UNIT_PRICE. Av de 199 som har tilstrekkelig data til ABC-klassifisering, havner 98 i A-klassen og 63 i B-klassen. Dersom standardprisen systematisk avviker fra faktisk innkjøpspris, kan ABC-rangeringen for disse artiklene være upresis. Risikoen dempes av at regelmotoren krever flere sammenfallende signaler (ABC + XYZ + EOQ/K-means) for OVERFØR-anbefaling – en isolert ABC-feil vil dermed sjelden alene utløse en feilklassifisering.</w:t>
       </w:r>
     </w:p>
     <w:p>
@@ -22129,7 +22162,7 @@
           <w:rFonts w:ascii="Times New Roman" w:hAnsi="Times New Roman" w:cs="Times New Roman"/>
           <w:sz w:val="24"/>
         </w:rPr>
-        <w:t>Modellen inkluderer ikke en eksplisitt kritikalitetsdimensjon som VED (Vital, Essential, Desirable). I sykehuslogistikk er kritikalitet en primær styringsparameter (Gupta et al., 2007; Gurumurthy et al., 2021), og fraværet innebærer at OVERFØR-anbefalingen kan omfatte artikler der leveringssvikt har alvorlige pasientkonsekvenser. Pilotvalideringen (anbefaling 1, kap. 9.2) bør eksplisitt inkludere en klinisk kritikalitetsvurdering som supplement til de kvantitative signalene.</w:t>
+        <w:t>Modellen inkluderer ikke en eksplisitt kritikalitetsdimensjon som VED (Vital, Essential, Desirable). I sykehuslogistikk er kritikalitet en primær styringsparameter (Gupta et al., 2007; Gurumurthy et al., 2021), og fraværet innebærer at OVERFØR-anbefalingen kan omfatte artikler der leveringssvikt har alvorlige pasientkonsekvenser. Kritikalitetsdata inngår ikke som strukturert variabel i det aktuelle datauttrekket; ved Helse Bergen er VED-vurderingen i praksis basert på klinisk skjønn og foreligger ikke i maskinlesbar form. Regelmotorens R1-regel (Z-override) fungerer som en delvis kompensasjon ved å holde artikler med uregelmessig forbruk lokalt, men dette erstatter ikke en eksplisitt kritikalitetsvurdering. Pilotvalideringen (anbefaling 1, kap. 9.2) bør eksplisitt inkludere en klinisk kritikalitetsvurdering som supplement til de kvantitative signalene.</w:t>
       </w:r>
     </w:p>
     <w:p>
@@ -22203,7 +22236,7 @@
           <w:i/>
           <w:sz w:val="24"/>
         </w:rPr>
-        <w:t>Hvordan kan multikriterieklassifisering og klyngeanalyse av SAP-transaksjonsdata identifisere hvilke artikler ved Helse Bergens forsyningslager (WERKS 3300, LGORT 3001) som bør overføres til HVFS, og hva er det estimerte besparelsespotensialet?</w:t>
+        <w:t>Hvordan kan multikriterieklassifisering og klyngeanalyse av SAP-transaksjonsdata identifisere hvilke artikler ved Helse Bergens forsyningslager (WERKS 3300, LGORT 3001) som er kandidater for overføring til HVFS, og hva er det estimerte besparelsespotensialet?</w:t>
       </w:r>
     </w:p>
     <w:p>
@@ -22391,7 +22424,7 @@
           <w:rFonts w:ascii="Times New Roman" w:hAnsi="Times New Roman" w:cs="Times New Roman"/>
           <w:sz w:val="24"/>
         </w:rPr>
-        <w:t>Basert på studiens funn rettes følgende fire anbefalinger til Helse Bergen og Helse Vest IKT:</w:t>
+        <w:t>Basert på studiens funn rettes følgende fire anbefalinger til Helse Bergen og Helse Vest IKT. Anbefalingene er formulert i prioritert rekkefølge, der anbefaling 1 og 3 er umiddelbare parallelle tiltak, anbefaling 2 er mellomfristig, og anbefaling 4 er en langsiktig evalueringssyklus:</w:t>
       </w:r>
     </w:p>
     <w:p>

</xml_diff>

<commit_message>
Rett 4 notasjonsinkonsistenser i matematiske formler
Gjennomgang av all matematisk notasjon (13 display-formler, ~40 inline-uttrykk):
- Linje 764: $B$ → $B_{\text{HVFS}}$, $\times$ → $\cdot$, legg til summasjonsområde
- Linje 537/503: Legg til $i$-indeks på $f_{\text{obs}}$ og $f^*$ for konsistens
- Linje 631: Legg til $i$-indeks på TC-argumenter i kap. 6.3

Co-Authored-By: Claude Opus 4.6 (1M context) <noreply@anthropic.com>
</commit_message>
<xml_diff>
--- a/005 report/LOG650_Rapport.docx
+++ b/005 report/LOG650_Rapport.docx
@@ -11989,6 +11989,9 @@
                     </m:rPr>
                     <m:t>obs</m:t>
                   </m:r>
+                  <m:r>
+                    <m:t>,i</m:t>
+                  </m:r>
                 </m:sub>
               </m:sSub>
               <m:r>
@@ -12000,18 +12003,23 @@
               <m:r>
                 <m:t>5·</m:t>
               </m:r>
-              <m:sSup>
+              <m:sSubSup>
                 <m:e>
                   <m:r>
                     <m:t>f</m:t>
                   </m:r>
                 </m:e>
+                <m:sub>
+                  <m:r>
+                    <m:t>i</m:t>
+                  </m:r>
+                </m:sub>
                 <m:sup>
                   <m:r>
                     <m:t>*</m:t>
                   </m:r>
                 </m:sup>
-              </m:sSup>
+              </m:sSubSup>
             </m:oMath>
             <w:r>
               <w:rPr>
@@ -12837,6 +12845,9 @@
               </m:rPr>
               <m:t>obs</m:t>
             </m:r>
+            <m:r>
+              <m:t>,i</m:t>
+            </m:r>
           </m:sub>
         </m:sSub>
         <m:r>
@@ -12857,18 +12868,23 @@
         <m:r>
           <m:t>·</m:t>
         </m:r>
-        <m:sSup>
+        <m:sSubSup>
           <m:e>
             <m:r>
               <m:t>f</m:t>
             </m:r>
           </m:e>
+          <m:sub>
+            <m:r>
+              <m:t>i</m:t>
+            </m:r>
+          </m:sub>
           <m:sup>
             <m:r>
               <m:t>*</m:t>
             </m:r>
           </m:sup>
-        </m:sSup>
+        </m:sSubSup>
       </m:oMath>
       <w:r>
         <w:rPr>
@@ -16108,23 +16124,31 @@
               </m:rPr>
               <m:t>obs</m:t>
             </m:r>
+            <m:r>
+              <m:t>,i</m:t>
+            </m:r>
           </m:sub>
         </m:sSub>
         <m:r>
           <m:t>)−TC(</m:t>
         </m:r>
-        <m:sSup>
+        <m:sSubSup>
           <m:e>
             <m:r>
               <m:t>f</m:t>
             </m:r>
           </m:e>
+          <m:sub>
+            <m:r>
+              <m:t>i</m:t>
+            </m:r>
+          </m:sub>
           <m:sup>
             <m:r>
               <m:t>*</m:t>
             </m:r>
           </m:sup>
-        </m:sSup>
+        </m:sSubSup>
         <m:r>
           <m:t>)</m:t>
         </m:r>
@@ -20305,8 +20329,23 @@
         <w:t xml:space="preserve">Besparelsesestimatet er beregnet for de 117 artiklene som oppfyller begge kriteriene OVERFØR\_HVFS og FOR\_MANGE\_ORDRER. Formelen er </w:t>
       </w:r>
       <m:oMath>
+        <m:sSub>
+          <m:e>
+            <m:r>
+              <m:t>B</m:t>
+            </m:r>
+          </m:e>
+          <m:sub>
+            <m:r>
+              <m:rPr>
+                <m:nor/>
+              </m:rPr>
+              <m:t>HVFS</m:t>
+            </m:r>
+          </m:sub>
+        </m:sSub>
         <m:r>
-          <m:t>B=</m:t>
+          <m:t>=</m:t>
         </m:r>
         <m:nary>
           <m:naryPr>
@@ -20318,7 +20357,13 @@
           </m:naryPr>
           <m:sub>
             <m:r>
-              <m:t>i</m:t>
+              <m:t>i∈</m:t>
+            </m:r>
+            <m:r>
+              <m:rPr>
+                <m:nor/>
+              </m:rPr>
+              <m:t>OVERFØR</m:t>
             </m:r>
           </m:sub>
           <m:sup/>
@@ -20341,7 +20386,7 @@
           </m:sub>
         </m:sSub>
         <m:r>
-          <m:t>×g</m:t>
+          <m:t>·g</m:t>
         </m:r>
       </m:oMath>
       <w:r>

</xml_diff>

<commit_message>
Polér modellformbeskrivelser og analysepipeline før innlevering
- Legg til faglig plassering i §1.1 og overordnet problemstilling i §1.2
- Beskriv lagernivåer (regional vs. lokal) eksplisitt i §3.1
- Merk modellformer i §4.1 og §5.1–5.4 (klassifiseringsregel, optimering, uovervåket ML)
- Utvid Fig 4-bildetekst til 5-stegs analysepipeline
- Juster KI-formulering i §4.5 til HiMolde-retningslinjene
- Legg til fjerde retning for videre forskning i §9.3 (AHP/TOPSIS, auksjoner, veiledet ML)
- Rett hardkodet filnavn i wordcount.py

Co-Authored-By: Claude Opus 4.7 (1M context) <noreply@anthropic.com>
</commit_message>
<xml_diff>
--- a/005 report/LOG650_Rapport.docx
+++ b/005 report/LOG650_Rapport.docx
@@ -5237,7 +5237,37 @@
           <w:rFonts w:ascii="Times New Roman" w:hAnsi="Times New Roman" w:cs="Times New Roman"/>
           <w:sz w:val="24"/>
         </w:rPr>
-        <w:t>Helse Bergen er det største helseforetaket i Helse Vest og drifter i dag et lokalt forsyningslager registrert som WERKS 3300 i SAP S/4HANA, med primærlagersted LGORT 3001. Lageret håndterer over 700 aktive artikler, men det mangler et systematisk, datadrevet grunnlag for å avgjøre hvilke av disse som egner seg for overføring til HVFS. Beslutningene tas i dag i stor grad basert på erfaring og skjønn, noe de Vries (2011) identifiserer som en typisk utfordring i sykehuslogistikk: interessentkonflikter og manglende informasjonssystemer hindrer rasjonell lageromstilling. Denne oppgaven adresserer dette gapet ved å anvende velprøvde klassifiseringsmetoder fra lagerstyringslitteraturen – ABC, XYZ og EOQ – kombinert med K-means klyngeanalyse, på operasjonelle transaksjonsdata fra SAP.</w:t>
+        <w:t xml:space="preserve">Helse Bergen er det største helseforetaket i Helse Vest og drifter i dag et lokalt forsyningslager registrert som WERKS 3300 i SAP S/4HANA, med primærlagersted LGORT 3001. Lageret håndterer over 700 aktive artikler, men det mangler et systematisk, datadrevet grunnlag for å avgjøre hvilke av disse som egner seg for overføring til HVFS. Beslutningene tas i dag i stor grad basert på erfaring og skjønn, noe de Vries (2011) identifiserer som en typisk utfordring i sykehuslogistikk: interessentkonflikter og manglende informasjonssystemer hindrer rasjonell lageromstilling. Denne oppgaven adresserer dette gapet ved å anvende velprøvde klassifiseringsmetoder fra lagerstyringslitteraturen – ABC, XYZ og EOQ – kombinert med K-means klyngeanalyse, på operasjonelle transaksjonsdata fra SAP. Faglig plasserer arbeidet seg dermed i skjæringspunktet mellom </w:t>
+      </w:r>
+      <w:r>
+        <w:rPr>
+          <w:rFonts w:ascii="Times New Roman" w:hAnsi="Times New Roman" w:cs="Times New Roman"/>
+          <w:b/>
+          <w:sz w:val="24"/>
+        </w:rPr>
+        <w:t>lagerstyring</w:t>
+      </w:r>
+      <w:r>
+        <w:rPr>
+          <w:rFonts w:ascii="Times New Roman" w:hAnsi="Times New Roman" w:cs="Times New Roman"/>
+          <w:sz w:val="24"/>
+        </w:rPr>
+        <w:t xml:space="preserve"> (klassifisering og lokaliseringsbeslutninger) og </w:t>
+      </w:r>
+      <w:r>
+        <w:rPr>
+          <w:rFonts w:ascii="Times New Roman" w:hAnsi="Times New Roman" w:cs="Times New Roman"/>
+          <w:b/>
+          <w:sz w:val="24"/>
+        </w:rPr>
+        <w:t>innkjøpsoptimalisering</w:t>
+      </w:r>
+      <w:r>
+        <w:rPr>
+          <w:rFonts w:ascii="Times New Roman" w:hAnsi="Times New Roman" w:cs="Times New Roman"/>
+          <w:sz w:val="24"/>
+        </w:rPr>
+        <w:t xml:space="preserve"> (ordrefrekvens og kostnadsavvik mot EOQ).</w:t>
       </w:r>
     </w:p>
     <w:p>
@@ -5263,7 +5293,7 @@
           <w:rFonts w:ascii="Times New Roman" w:hAnsi="Times New Roman" w:cs="Times New Roman"/>
           <w:sz w:val="24"/>
         </w:rPr>
-        <w:t>Oppgaven besvarer følgende forskningsspørsmål:</w:t>
+        <w:t>Oppgavens overordnede problemstilling er hvordan datadrevet klassifisering av eksisterende SAP-transaksjonsdata kan understøtte beslutningen om hvilke artikler som bør sentraliseres til HVFS, og hva en slik sentralisering er verdt økonomisk. Denne problemstillingen operasjonaliseres gjennom følgende forskningsspørsmål, som gjør klassifiseringen, identifikasjonen og kvantifiseringen empirisk testbar:</w:t>
       </w:r>
     </w:p>
     <w:p>
@@ -8143,7 +8173,37 @@
           <w:rFonts w:ascii="Times New Roman" w:hAnsi="Times New Roman" w:cs="Times New Roman"/>
           <w:sz w:val="24"/>
         </w:rPr>
-        <w:t>Helse Bergen HF er det største helseforetaket i Helse Vest RHF og drifter Haukeland Universitetssykehus med ansvar for spesialisthelsetjenester til et opptaksområde på nær en halv million innbyggere. Helse Vest koordinerer fire helseforetak (Bergen, Stavanger, Fonna, Førde), og en regionalt harmonisert tilnærming til materialforvaltning har fått økt prioritet for å oppnå stordriftsfordeler.</w:t>
+        <w:t xml:space="preserve">Helse Bergen HF er det største helseforetaket i Helse Vest RHF og drifter Haukeland Universitetssykehus med ansvar for spesialisthelsetjenester til et opptaksområde på nær en halv million innbyggere. Helse Vest koordinerer fire helseforetak (Bergen, Stavanger, Fonna, Førde), og en regionalt harmonisert tilnærming til materialforvaltning har fått økt prioritet for å oppnå stordriftsfordeler. Forsyningsstrukturen organiserer seg langs to nivåer: et </w:t>
+      </w:r>
+      <w:r>
+        <w:rPr>
+          <w:rFonts w:ascii="Times New Roman" w:hAnsi="Times New Roman" w:cs="Times New Roman"/>
+          <w:b/>
+          <w:sz w:val="24"/>
+        </w:rPr>
+        <w:t>regionalt sentrallager</w:t>
+      </w:r>
+      <w:r>
+        <w:rPr>
+          <w:rFonts w:ascii="Times New Roman" w:hAnsi="Times New Roman" w:cs="Times New Roman"/>
+          <w:sz w:val="24"/>
+        </w:rPr>
+        <w:t xml:space="preserve"> (HVFS) og </w:t>
+      </w:r>
+      <w:r>
+        <w:rPr>
+          <w:rFonts w:ascii="Times New Roman" w:hAnsi="Times New Roman" w:cs="Times New Roman"/>
+          <w:b/>
+          <w:sz w:val="24"/>
+        </w:rPr>
+        <w:t>lokale forsyningslagre / lokallagre</w:t>
+      </w:r>
+      <w:r>
+        <w:rPr>
+          <w:rFonts w:ascii="Times New Roman" w:hAnsi="Times New Roman" w:cs="Times New Roman"/>
+          <w:sz w:val="24"/>
+        </w:rPr>
+        <w:t xml:space="preserve"> ved hvert helseforetak. Denne oppgaven analyserer Helse Bergens lokallager ved WERKS 3300 og kandidater for sentralisering opp til HVFS.</w:t>
       </w:r>
     </w:p>
     <w:p>
@@ -9051,6 +9111,32 @@
     </w:p>
     <w:p>
       <w:pPr>
+        <w:spacing w:line="360" w:lineRule="auto"/>
+        <w:jc w:val="both"/>
+      </w:pPr>
+      <w:r>
+        <w:rPr>
+          <w:rFonts w:ascii="Times New Roman" w:hAnsi="Times New Roman" w:cs="Times New Roman"/>
+          <w:sz w:val="24"/>
+        </w:rPr>
+        <w:t>De fem analytiske teknikkene som anvendes har ulik metodisk natur, og det er ikke hensiktsmessig å presse dem inn i én felles modellmal. ABC-analyse og XYZ-klassifisering er deskriptive klassifiseringsregler som henholdsvis fanger verdi- og stabilitetsdimensjonen. EOQ (Wilson) er en klassisk optimeringsmodell som beregner optimal ordrefrekvens og det resulterende kostnadsavviket. K-means klyngeanalyse er en form for uovervåket maskinlæring som gir multivariat segmentering uten forhåndsdefinerte terskler. Regelmotoren er regelbasert beslutningslogikk som sekvensielt aggregerer de øvrige signalene til én anbefaling per artikkel.</w:t>
+      </w:r>
+    </w:p>
+    <w:p>
+      <w:pPr>
+        <w:spacing w:line="360" w:lineRule="auto"/>
+        <w:jc w:val="both"/>
+      </w:pPr>
+      <w:r>
+        <w:rPr>
+          <w:rFonts w:ascii="Times New Roman" w:hAnsi="Times New Roman" w:cs="Times New Roman"/>
+          <w:sz w:val="24"/>
+        </w:rPr>
+        <w:t>Arbeidet følger en faseinndelt prosjektlogikk fra problemavklaring via litteratur og modellering, til analyse, validering og rapportering – hvor hvert steg bygger på utfallet av det foregående.</w:t>
+      </w:r>
+    </w:p>
+    <w:p>
+      <w:pPr>
         <w:pStyle w:val="Overskrift2"/>
       </w:pPr>
       <w:r>
@@ -10887,7 +10973,82 @@
           <w:rFonts w:ascii="Times New Roman" w:hAnsi="Times New Roman" w:cs="Times New Roman"/>
           <w:sz w:val="24"/>
         </w:rPr>
-        <w:t>Figur 4 nedenfor illustrerer den samlede datapipelinen fra rådata til analyseklart datasett.</w:t>
+        <w:t xml:space="preserve">Figur 4 nedenfor illustrerer den samlede analyseprosessen som en sekvens i fem steg: (1) </w:t>
+      </w:r>
+      <w:r>
+        <w:rPr>
+          <w:rFonts w:ascii="Times New Roman" w:hAnsi="Times New Roman" w:cs="Times New Roman"/>
+          <w:b/>
+          <w:sz w:val="24"/>
+        </w:rPr>
+        <w:t>data</w:t>
+      </w:r>
+      <w:r>
+        <w:rPr>
+          <w:rFonts w:ascii="Times New Roman" w:hAnsi="Times New Roman" w:cs="Times New Roman"/>
+          <w:sz w:val="24"/>
+        </w:rPr>
+        <w:t xml:space="preserve"> – SAP-uttrekk via SE16H, (2) </w:t>
+      </w:r>
+      <w:r>
+        <w:rPr>
+          <w:rFonts w:ascii="Times New Roman" w:hAnsi="Times New Roman" w:cs="Times New Roman"/>
+          <w:b/>
+          <w:sz w:val="24"/>
+        </w:rPr>
+        <w:t>forutsetninger og datavalg</w:t>
+      </w:r>
+      <w:r>
+        <w:rPr>
+          <w:rFonts w:ascii="Times New Roman" w:hAnsi="Times New Roman" w:cs="Times New Roman"/>
+          <w:sz w:val="24"/>
+        </w:rPr>
+        <w:t xml:space="preserve"> – populasjonsavgrensning, PEINH-korrigering og åtte dokumenterte beslutninger (D-01–D-08), (3) </w:t>
+      </w:r>
+      <w:r>
+        <w:rPr>
+          <w:rFonts w:ascii="Times New Roman" w:hAnsi="Times New Roman" w:cs="Times New Roman"/>
+          <w:b/>
+          <w:sz w:val="24"/>
+        </w:rPr>
+        <w:t>løsning og modellkjøring</w:t>
+      </w:r>
+      <w:r>
+        <w:rPr>
+          <w:rFonts w:ascii="Times New Roman" w:hAnsi="Times New Roman" w:cs="Times New Roman"/>
+          <w:sz w:val="24"/>
+        </w:rPr>
+        <w:t xml:space="preserve"> – ABC, XYZ, EOQ og K-means kjørt på det forbehandlede datasettet, (4) </w:t>
+      </w:r>
+      <w:r>
+        <w:rPr>
+          <w:rFonts w:ascii="Times New Roman" w:hAnsi="Times New Roman" w:cs="Times New Roman"/>
+          <w:b/>
+          <w:sz w:val="24"/>
+        </w:rPr>
+        <w:t>kontroll og validering</w:t>
+      </w:r>
+      <w:r>
+        <w:rPr>
+          <w:rFonts w:ascii="Times New Roman" w:hAnsi="Times New Roman" w:cs="Times New Roman"/>
+          <w:sz w:val="24"/>
+        </w:rPr>
+        <w:t xml:space="preserve"> – kryssvalidering mot ZZXYZ, silhouette på trenings- og testsett, samt sensitivitetsanalyse, og (5) </w:t>
+      </w:r>
+      <w:r>
+        <w:rPr>
+          <w:rFonts w:ascii="Times New Roman" w:hAnsi="Times New Roman" w:cs="Times New Roman"/>
+          <w:b/>
+          <w:sz w:val="24"/>
+        </w:rPr>
+        <w:t>anvendelse og anbefaling</w:t>
+      </w:r>
+      <w:r>
+        <w:rPr>
+          <w:rFonts w:ascii="Times New Roman" w:hAnsi="Times New Roman" w:cs="Times New Roman"/>
+          <w:sz w:val="24"/>
+        </w:rPr>
+        <w:t xml:space="preserve"> – regelmotorens utfall per artikkel og besparelsesestimat.</w:t>
       </w:r>
     </w:p>
     <w:p>
@@ -10936,7 +11097,7 @@
           <w:i/>
           <w:sz w:val="20"/>
         </w:rPr>
-        <w:t>Figur 4. Analysepipeline: fra SAP-rådata til HVFS-anbefaling. Generert med støtte fra Claude.</w:t>
+        <w:t>Figur 4. Analysepipeline i fem steg: data → forutsetninger/datavalg → løsning/modellkjøring → kontroll/validering → anvendelse/anbefaling. Generert med støtte fra Claude.</w:t>
       </w:r>
     </w:p>
     <w:p>
@@ -11027,7 +11188,7 @@
           <w:rFonts w:ascii="Times New Roman" w:hAnsi="Times New Roman" w:cs="Times New Roman"/>
           <w:sz w:val="24"/>
         </w:rPr>
-        <w:t>Kunstig intelligens i form av store språkmodeller ble benyttet som faglig støtteverktøy gjennom hele prosjektperioden, i tråd med retningslinjene i kursets skrivekompendium. Claude ble anvendt til kodestøtte, generering av datavisualiseringer og språklig bearbeiding av rapportteksten. KI-verktøyet er ikke brukt som fagkilde og er ikke sitert som belegg for faglige påstander. All KI-generert kode og tekst er kritisk gjennomgått og revidert av forfatteren; en refleksjon over KI-brukens påvirkning på arbeidsprosessen er gitt i Vedlegg C.</w:t>
+        <w:t>Kunstig intelligens i form av store språkmodeller ble benyttet som faglig støtteverktøy gjennom hele prosjektperioden, i tråd med Høgskolen i Moldes retningslinjer for bruk av KI ved hjemmeeksamen. Claude ble anvendt til kodestøtte, generering av datavisualiseringer og språklig bearbeiding av rapportteksten. KI-verktøyet er ikke brukt som fagkilde og er ikke sitert som belegg for faglige påstander. All KI-generert kode og tekst er kritisk gjennomgått og revidert av forfatteren; en refleksjon over KI-brukens påvirkning på arbeidsprosessen er gitt i Vedlegg C.</w:t>
       </w:r>
     </w:p>
     <w:p>
@@ -11067,7 +11228,22 @@
           <w:rFonts w:ascii="Times New Roman" w:hAnsi="Times New Roman" w:cs="Times New Roman"/>
           <w:sz w:val="24"/>
         </w:rPr>
-        <w:t>ABC-analyse er en rangerings- og klassifiseringsmetode basert på Pareto-prinsippet, som postulerer at en liten andel av artiklene i et lager typisk står for hoveddelen av den totale verdibindingen (Gupta et al., 2007). Metoden gir en strukturert tilnærming til å skille artikler som krever tett styring fra artikler der en enklere tilnærming er tilstrekkelig (van Kampen et al., 2012).</w:t>
+        <w:t xml:space="preserve">ABC-analyse er en rangerings- og klassifiseringsmetode basert på Pareto-prinsippet, som postulerer at en liten andel av artiklene i et lager typisk står for hoveddelen av den totale verdibindingen (Gupta et al., 2007). Metoden gir en strukturert tilnærming til å skille artikler som krever tett styring fra artikler der en enklere tilnærming er tilstrekkelig (van Kampen et al., 2012). Modellformen er en </w:t>
+      </w:r>
+      <w:r>
+        <w:rPr>
+          <w:rFonts w:ascii="Times New Roman" w:hAnsi="Times New Roman" w:cs="Times New Roman"/>
+          <w:b/>
+          <w:sz w:val="24"/>
+        </w:rPr>
+        <w:t>klassifiseringsregel</w:t>
+      </w:r>
+      <w:r>
+        <w:rPr>
+          <w:rFonts w:ascii="Times New Roman" w:hAnsi="Times New Roman" w:cs="Times New Roman"/>
+          <w:sz w:val="24"/>
+        </w:rPr>
+        <w:t>: én årsverdi per artikkel, to kumulative terskelverdier (80 % og 95 %), og ett beslutningskriterium som tilordner hver artikkel til klasse A, B eller C.</w:t>
       </w:r>
     </w:p>
     <w:p>
@@ -12364,7 +12540,22 @@
           <w:rFonts w:ascii="Times New Roman" w:hAnsi="Times New Roman" w:cs="Times New Roman"/>
           <w:sz w:val="24"/>
         </w:rPr>
-        <w:t>XYZ-klassifisering beskriver stabilitet i forbruksmønsteret over tid, og komplementerer ABC-analysen ved å skille artikler med forutsigbar etterspørsel fra artikler med uregelmessig forbruk (Nowotyńska, 2013). Grunnlaget for klassifiseringen er variasjonskoeffisienten CV (coefficient of variation), beregnet fra månedlig forbruk over analyseperioden på 24 måneder:</w:t>
+        <w:t xml:space="preserve">XYZ-klassifisering beskriver stabilitet i forbruksmønsteret over tid, og komplementerer ABC-analysen ved å skille artikler med forutsigbar etterspørsel fra artikler med uregelmessig forbruk (Nowotyńska, 2013). Modellformen er en </w:t>
+      </w:r>
+      <w:r>
+        <w:rPr>
+          <w:rFonts w:ascii="Times New Roman" w:hAnsi="Times New Roman" w:cs="Times New Roman"/>
+          <w:b/>
+          <w:sz w:val="24"/>
+        </w:rPr>
+        <w:t>klassifiseringsregel</w:t>
+      </w:r>
+      <w:r>
+        <w:rPr>
+          <w:rFonts w:ascii="Times New Roman" w:hAnsi="Times New Roman" w:cs="Times New Roman"/>
+          <w:sz w:val="24"/>
+        </w:rPr>
+        <w:t xml:space="preserve"> med ett beregnet inngangsmål (CV) og to terskelverdier (0,5 og 1,0), som tilordner hver artikkel til klasse X, Y eller Z. Grunnlaget for klassifiseringen er variasjonskoeffisienten CV (coefficient of variation), beregnet fra månedlig forbruk over analyseperioden på 24 måneder:</w:t>
       </w:r>
     </w:p>
     <w:p>
@@ -12530,6 +12721,106 @@
           <w:sz w:val="32"/>
         </w:rPr>
         <w:t>5.3 EOQ-modellen og besparelsesformelen</w:t>
+      </w:r>
+    </w:p>
+    <w:p>
+      <w:pPr>
+        <w:spacing w:line="360" w:lineRule="auto"/>
+        <w:jc w:val="both"/>
+      </w:pPr>
+      <w:r>
+        <w:rPr>
+          <w:rFonts w:ascii="Times New Roman" w:hAnsi="Times New Roman" w:cs="Times New Roman"/>
+          <w:sz w:val="24"/>
+        </w:rPr>
+        <w:t xml:space="preserve">EOQ er den eneste komponenten i rammeverket med en klassisk </w:t>
+      </w:r>
+      <w:r>
+        <w:rPr>
+          <w:rFonts w:ascii="Times New Roman" w:hAnsi="Times New Roman" w:cs="Times New Roman"/>
+          <w:b/>
+          <w:sz w:val="24"/>
+        </w:rPr>
+        <w:t>optimeringsmodell</w:t>
+      </w:r>
+      <w:r>
+        <w:rPr>
+          <w:rFonts w:ascii="Times New Roman" w:hAnsi="Times New Roman" w:cs="Times New Roman"/>
+          <w:sz w:val="24"/>
+        </w:rPr>
+        <w:t xml:space="preserve">: parametrene er </w:t>
+      </w:r>
+      <m:oMath>
+        <m:r>
+          <m:t>D</m:t>
+        </m:r>
+      </m:oMath>
+      <w:r>
+        <w:rPr>
+          <w:rFonts w:ascii="Times New Roman" w:hAnsi="Times New Roman" w:cs="Times New Roman"/>
+          <w:sz w:val="24"/>
+        </w:rPr>
+        <w:t xml:space="preserve"> (årsforbruk), </w:t>
+      </w:r>
+      <m:oMath>
+        <m:r>
+          <m:t>S</m:t>
+        </m:r>
+      </m:oMath>
+      <w:r>
+        <w:rPr>
+          <w:rFonts w:ascii="Times New Roman" w:hAnsi="Times New Roman" w:cs="Times New Roman"/>
+          <w:sz w:val="24"/>
+        </w:rPr>
+        <w:t xml:space="preserve"> (ordrekostnad) og </w:t>
+      </w:r>
+      <m:oMath>
+        <m:r>
+          <m:t>H</m:t>
+        </m:r>
+      </m:oMath>
+      <w:r>
+        <w:rPr>
+          <w:rFonts w:ascii="Times New Roman" w:hAnsi="Times New Roman" w:cs="Times New Roman"/>
+          <w:sz w:val="24"/>
+        </w:rPr>
+        <w:t xml:space="preserve"> (holdekostnad per enhet); beslutningsvariabelen er ordrefrekvens </w:t>
+      </w:r>
+      <m:oMath>
+        <m:r>
+          <m:t>f</m:t>
+        </m:r>
+      </m:oMath>
+      <w:r>
+        <w:rPr>
+          <w:rFonts w:ascii="Times New Roman" w:hAnsi="Times New Roman" w:cs="Times New Roman"/>
+          <w:sz w:val="24"/>
+        </w:rPr>
+        <w:t xml:space="preserve"> (eller ekvivalent ordrekvantum </w:t>
+      </w:r>
+      <m:oMath>
+        <m:r>
+          <m:t>Q</m:t>
+        </m:r>
+      </m:oMath>
+      <w:r>
+        <w:rPr>
+          <w:rFonts w:ascii="Times New Roman" w:hAnsi="Times New Roman" w:cs="Times New Roman"/>
+          <w:sz w:val="24"/>
+        </w:rPr>
+        <w:t xml:space="preserve">); målfunksjonen er total årlig kostnad </w:t>
+      </w:r>
+      <m:oMath>
+        <m:r>
+          <m:t>TC(f)=fS+DH/(2f)</m:t>
+        </m:r>
+      </m:oMath>
+      <w:r>
+        <w:rPr>
+          <w:rFonts w:ascii="Times New Roman" w:hAnsi="Times New Roman" w:cs="Times New Roman"/>
+          <w:sz w:val="24"/>
+        </w:rPr>
+        <w:t>; og forutsetningene er konstant og kjent etterspørsel, øyeblikkelig leveranse, ingen kvantumsrabatter og lineær holdekostnad.</w:t>
       </w:r>
     </w:p>
     <w:p>
@@ -13531,7 +13822,7 @@
           <w:rFonts w:ascii="Times New Roman" w:hAnsi="Times New Roman" w:cs="Times New Roman"/>
           <w:sz w:val="24"/>
         </w:rPr>
-        <w:t xml:space="preserve"> modellerer kostnadsavviket fra suboptimal ordrefrekvens – en avvik som nettopp adresseres ved sentralisering til HVFS. Sensitivitetsanalysen i kapittel 7 undersøker robustheten av dette estimatet ved systematisk variasjon i </w:t>
+        <w:t xml:space="preserve"> modellerer kostnadsavviket fra suboptimal ordrefrekvens – et avvik som nettopp adresseres ved sentralisering til HVFS. Sensitivitetsanalysen i kapittel 7 undersøker robustheten av dette estimatet ved systematisk variasjon i </w:t>
       </w:r>
       <m:oMath>
         <m:r>
@@ -14499,7 +14790,22 @@
           <w:rFonts w:ascii="Times New Roman" w:hAnsi="Times New Roman" w:cs="Times New Roman"/>
           <w:sz w:val="24"/>
         </w:rPr>
-        <w:t xml:space="preserve"> K-means er inkludert i rammeverket av to begrunnede årsaker. For det første gir metoden </w:t>
+        <w:t xml:space="preserve"> K-means er valgt som </w:t>
+      </w:r>
+      <w:r>
+        <w:rPr>
+          <w:rFonts w:ascii="Times New Roman" w:hAnsi="Times New Roman" w:cs="Times New Roman"/>
+          <w:b/>
+          <w:sz w:val="24"/>
+        </w:rPr>
+        <w:t>uovervåket maskinlæring</w:t>
+      </w:r>
+      <w:r>
+        <w:rPr>
+          <w:rFonts w:ascii="Times New Roman" w:hAnsi="Times New Roman" w:cs="Times New Roman"/>
+          <w:sz w:val="24"/>
+        </w:rPr>
+        <w:t xml:space="preserve"> fordi datasettet ikke inneholder merkede fasitklasser for HVFS-egnethet – en veiledet algoritme ville derfor ikke ha noe å trenes mot. Metoden er inkludert i rammeverket av to begrunnede årsaker. For det første gir den </w:t>
       </w:r>
       <w:r>
         <w:rPr>
@@ -23372,7 +23678,7 @@
           <w:rFonts w:ascii="Times New Roman" w:hAnsi="Times New Roman" w:cs="Times New Roman"/>
           <w:sz w:val="24"/>
         </w:rPr>
-        <w:t xml:space="preserve">Studien åpner for tre retninger innen videre forskning: (1) En </w:t>
+        <w:t xml:space="preserve">Studien åpner for fire retninger innen videre forskning: (1) En </w:t>
       </w:r>
       <w:r>
         <w:rPr>
@@ -23417,7 +23723,22 @@
           <w:rFonts w:ascii="Times New Roman" w:hAnsi="Times New Roman" w:cs="Times New Roman"/>
           <w:sz w:val="24"/>
         </w:rPr>
-        <w:t xml:space="preserve"> av rammeverket til andre WERKS i Helse Vest (Stavanger, Fonna, Førde) vil styrke den eksterne validiteten og gi grunnlag for differensiert HVFS-sentralisering per foretak.</w:t>
+        <w:t xml:space="preserve"> av rammeverket til andre WERKS i Helse Vest (Stavanger, Fonna, Førde) vil styrke den eksterne validiteten og gi grunnlag for differensiert HVFS-sentralisering per foretak. (4) </w:t>
+      </w:r>
+      <w:r>
+        <w:rPr>
+          <w:rFonts w:ascii="Times New Roman" w:hAnsi="Times New Roman" w:cs="Times New Roman"/>
+          <w:b/>
+          <w:sz w:val="24"/>
+        </w:rPr>
+        <w:t>Utvidet metoderepertoar innen innkjøpsoptimalisering</w:t>
+      </w:r>
+      <w:r>
+        <w:rPr>
+          <w:rFonts w:ascii="Times New Roman" w:hAnsi="Times New Roman" w:cs="Times New Roman"/>
+          <w:sz w:val="24"/>
+        </w:rPr>
+        <w:t xml:space="preserve"> – flerkriterieteknikker som AHP/TOPSIS for leverandørvurdering, kombinatoriske auksjoner for porteføljeanskaffelser, og veiledet maskinlæring (når det foreligger merkede beslutningsdata fra pilotfasen) – er relevante videreføringer som faller utenfor denne oppgavens scope, men som kan gi ytterligere beslutningsgrunnlag for innkjøpsstrategien rundt HVFS.</w:t>
       </w:r>
     </w:p>
     <w:p>

</xml_diff>